<commit_message>
WebSetup on remote hosts using Bash Script and SSH
</commit_message>
<xml_diff>
--- a/Bash Scripting 101/SSH.docx
+++ b/Bash Scripting 101/SSH.docx
@@ -206,6 +206,3465 @@
         <w:t>Now when you execute ssh command, it won’t ask password on the ssh client.</w:t>
       </w:r>
     </w:p>
+    <w:p/>
+    <w:p>
+      <w:pPr>
+        <w:rPr>
+          <w:b/>
+          <w:bCs/>
+        </w:rPr>
+      </w:pPr>
+      <w:r>
+        <w:rPr>
+          <w:b/>
+          <w:bCs/>
+        </w:rPr>
+        <w:t>Remote Command Execution</w:t>
+      </w:r>
+    </w:p>
+    <w:p>
+      <w:r>
+        <w:t>We have 4 VMs: scriptbox, web01, web02, web03</w:t>
+      </w:r>
+    </w:p>
+    <w:p>
+      <w:r>
+        <w:t>We will set ssh key on the last 3 VMs so that they’re accessible via ‘scriptbox’ VM</w:t>
+      </w:r>
+    </w:p>
+    <w:p>
+      <w:pPr>
+        <w:pStyle w:val="ListParagraph"/>
+        <w:numPr>
+          <w:ilvl w:val="0"/>
+          <w:numId w:val="4"/>
+        </w:numPr>
+      </w:pPr>
+      <w:r>
+        <w:lastRenderedPageBreak/>
+        <w:t>Logging in to vagrant user of the host-web01</w:t>
+      </w:r>
+      <w:r>
+        <w:drawing>
+          <wp:inline distT="0" distB="0" distL="0" distR="0" wp14:anchorId="4F61DC40" wp14:editId="784B5CB6">
+            <wp:extent cx="5395428" cy="2606266"/>
+            <wp:effectExtent l="0" t="0" r="0" b="3810"/>
+            <wp:docPr id="601317307" name="Picture 1"/>
+            <wp:cNvGraphicFramePr>
+              <a:graphicFrameLocks xmlns:a="http://schemas.openxmlformats.org/drawingml/2006/main" noChangeAspect="1"/>
+            </wp:cNvGraphicFramePr>
+            <a:graphic xmlns:a="http://schemas.openxmlformats.org/drawingml/2006/main">
+              <a:graphicData uri="http://schemas.openxmlformats.org/drawingml/2006/picture">
+                <pic:pic xmlns:pic="http://schemas.openxmlformats.org/drawingml/2006/picture">
+                  <pic:nvPicPr>
+                    <pic:cNvPr id="601317307" name=""/>
+                    <pic:cNvPicPr/>
+                  </pic:nvPicPr>
+                  <pic:blipFill>
+                    <a:blip r:embed="rId5"/>
+                    <a:stretch>
+                      <a:fillRect/>
+                    </a:stretch>
+                  </pic:blipFill>
+                  <pic:spPr>
+                    <a:xfrm>
+                      <a:off x="0" y="0"/>
+                      <a:ext cx="5395428" cy="2606266"/>
+                    </a:xfrm>
+                    <a:prstGeom prst="rect">
+                      <a:avLst/>
+                    </a:prstGeom>
+                  </pic:spPr>
+                </pic:pic>
+              </a:graphicData>
+            </a:graphic>
+          </wp:inline>
+        </w:drawing>
+      </w:r>
+    </w:p>
+    <w:p>
+      <w:pPr>
+        <w:pStyle w:val="ListParagraph"/>
+        <w:numPr>
+          <w:ilvl w:val="0"/>
+          <w:numId w:val="4"/>
+        </w:numPr>
+      </w:pPr>
+      <w:r>
+        <w:t>We will create another user and login to that account with ssh</w:t>
+      </w:r>
+    </w:p>
+    <w:p>
+      <w:r>
+        <w:drawing>
+          <wp:inline distT="0" distB="0" distL="0" distR="0" wp14:anchorId="680041BE" wp14:editId="6CE6F687">
+            <wp:extent cx="3825572" cy="1082134"/>
+            <wp:effectExtent l="0" t="0" r="3810" b="3810"/>
+            <wp:docPr id="866503941" name="Picture 1"/>
+            <wp:cNvGraphicFramePr>
+              <a:graphicFrameLocks xmlns:a="http://schemas.openxmlformats.org/drawingml/2006/main" noChangeAspect="1"/>
+            </wp:cNvGraphicFramePr>
+            <a:graphic xmlns:a="http://schemas.openxmlformats.org/drawingml/2006/main">
+              <a:graphicData uri="http://schemas.openxmlformats.org/drawingml/2006/picture">
+                <pic:pic xmlns:pic="http://schemas.openxmlformats.org/drawingml/2006/picture">
+                  <pic:nvPicPr>
+                    <pic:cNvPr id="866503941" name=""/>
+                    <pic:cNvPicPr/>
+                  </pic:nvPicPr>
+                  <pic:blipFill>
+                    <a:blip r:embed="rId6"/>
+                    <a:stretch>
+                      <a:fillRect/>
+                    </a:stretch>
+                  </pic:blipFill>
+                  <pic:spPr>
+                    <a:xfrm>
+                      <a:off x="0" y="0"/>
+                      <a:ext cx="3825572" cy="1082134"/>
+                    </a:xfrm>
+                    <a:prstGeom prst="rect">
+                      <a:avLst/>
+                    </a:prstGeom>
+                  </pic:spPr>
+                </pic:pic>
+              </a:graphicData>
+            </a:graphic>
+          </wp:inline>
+        </w:drawing>
+      </w:r>
+    </w:p>
+    <w:p>
+      <w:pPr>
+        <w:pStyle w:val="ListParagraph"/>
+        <w:numPr>
+          <w:ilvl w:val="0"/>
+          <w:numId w:val="4"/>
+        </w:numPr>
+      </w:pPr>
+      <w:r>
+        <w:t>Since we want to run system commands like installing packages, adding users, etc. this user will need sudoers permission</w:t>
+      </w:r>
+      <w:r>
+        <w:t>. Add user ‘devops’ to sudoers file</w:t>
+      </w:r>
+    </w:p>
+    <w:p>
+      <w:r>
+        <w:drawing>
+          <wp:inline distT="0" distB="0" distL="0" distR="0" wp14:anchorId="21CCA6B0" wp14:editId="43236FA6">
+            <wp:extent cx="1615580" cy="198137"/>
+            <wp:effectExtent l="0" t="0" r="3810" b="0"/>
+            <wp:docPr id="676532417" name="Picture 1"/>
+            <wp:cNvGraphicFramePr>
+              <a:graphicFrameLocks xmlns:a="http://schemas.openxmlformats.org/drawingml/2006/main" noChangeAspect="1"/>
+            </wp:cNvGraphicFramePr>
+            <a:graphic xmlns:a="http://schemas.openxmlformats.org/drawingml/2006/main">
+              <a:graphicData uri="http://schemas.openxmlformats.org/drawingml/2006/picture">
+                <pic:pic xmlns:pic="http://schemas.openxmlformats.org/drawingml/2006/picture">
+                  <pic:nvPicPr>
+                    <pic:cNvPr id="676532417" name=""/>
+                    <pic:cNvPicPr/>
+                  </pic:nvPicPr>
+                  <pic:blipFill>
+                    <a:blip r:embed="rId7"/>
+                    <a:stretch>
+                      <a:fillRect/>
+                    </a:stretch>
+                  </pic:blipFill>
+                  <pic:spPr>
+                    <a:xfrm>
+                      <a:off x="0" y="0"/>
+                      <a:ext cx="1615580" cy="198137"/>
+                    </a:xfrm>
+                    <a:prstGeom prst="rect">
+                      <a:avLst/>
+                    </a:prstGeom>
+                  </pic:spPr>
+                </pic:pic>
+              </a:graphicData>
+            </a:graphic>
+          </wp:inline>
+        </w:drawing>
+      </w:r>
+    </w:p>
+    <w:p>
+      <w:r>
+        <w:t>Add the line highlighted in red</w:t>
+      </w:r>
+    </w:p>
+    <w:p>
+      <w:r>
+        <w:drawing>
+          <wp:inline distT="0" distB="0" distL="0" distR="0" wp14:anchorId="24420442" wp14:editId="13AA1F16">
+            <wp:extent cx="4503810" cy="815411"/>
+            <wp:effectExtent l="0" t="0" r="0" b="3810"/>
+            <wp:docPr id="93909881" name="Picture 1"/>
+            <wp:cNvGraphicFramePr>
+              <a:graphicFrameLocks xmlns:a="http://schemas.openxmlformats.org/drawingml/2006/main" noChangeAspect="1"/>
+            </wp:cNvGraphicFramePr>
+            <a:graphic xmlns:a="http://schemas.openxmlformats.org/drawingml/2006/main">
+              <a:graphicData uri="http://schemas.openxmlformats.org/drawingml/2006/picture">
+                <pic:pic xmlns:pic="http://schemas.openxmlformats.org/drawingml/2006/picture">
+                  <pic:nvPicPr>
+                    <pic:cNvPr id="93909881" name=""/>
+                    <pic:cNvPicPr/>
+                  </pic:nvPicPr>
+                  <pic:blipFill>
+                    <a:blip r:embed="rId8"/>
+                    <a:stretch>
+                      <a:fillRect/>
+                    </a:stretch>
+                  </pic:blipFill>
+                  <pic:spPr>
+                    <a:xfrm>
+                      <a:off x="0" y="0"/>
+                      <a:ext cx="4503810" cy="815411"/>
+                    </a:xfrm>
+                    <a:prstGeom prst="rect">
+                      <a:avLst/>
+                    </a:prstGeom>
+                  </pic:spPr>
+                </pic:pic>
+              </a:graphicData>
+            </a:graphic>
+          </wp:inline>
+        </w:drawing>
+      </w:r>
+    </w:p>
+    <w:p>
+      <w:pPr>
+        <w:pStyle w:val="ListParagraph"/>
+        <w:numPr>
+          <w:ilvl w:val="0"/>
+          <w:numId w:val="4"/>
+        </w:numPr>
+      </w:pPr>
+      <w:r>
+        <w:t>Do the same for web02</w:t>
+      </w:r>
+    </w:p>
+    <w:p>
+      <w:pPr>
+        <w:pStyle w:val="ListParagraph"/>
+        <w:numPr>
+          <w:ilvl w:val="0"/>
+          <w:numId w:val="4"/>
+        </w:numPr>
+      </w:pPr>
+      <w:r>
+        <w:t>For web03, since it’s an Ubuntu OS,</w:t>
+      </w:r>
+      <w:r>
+        <w:t xml:space="preserve"> you can login only using ssh-key but not password.</w:t>
+      </w:r>
+    </w:p>
+    <w:p>
+      <w:r>
+        <w:drawing>
+          <wp:inline distT="0" distB="0" distL="0" distR="0" wp14:anchorId="00B8FAF7" wp14:editId="53809139">
+            <wp:extent cx="3177815" cy="419136"/>
+            <wp:effectExtent l="0" t="0" r="3810" b="0"/>
+            <wp:docPr id="314219497" name="Picture 1"/>
+            <wp:cNvGraphicFramePr>
+              <a:graphicFrameLocks xmlns:a="http://schemas.openxmlformats.org/drawingml/2006/main" noChangeAspect="1"/>
+            </wp:cNvGraphicFramePr>
+            <a:graphic xmlns:a="http://schemas.openxmlformats.org/drawingml/2006/main">
+              <a:graphicData uri="http://schemas.openxmlformats.org/drawingml/2006/picture">
+                <pic:pic xmlns:pic="http://schemas.openxmlformats.org/drawingml/2006/picture">
+                  <pic:nvPicPr>
+                    <pic:cNvPr id="314219497" name=""/>
+                    <pic:cNvPicPr/>
+                  </pic:nvPicPr>
+                  <pic:blipFill>
+                    <a:blip r:embed="rId9"/>
+                    <a:stretch>
+                      <a:fillRect/>
+                    </a:stretch>
+                  </pic:blipFill>
+                  <pic:spPr>
+                    <a:xfrm>
+                      <a:off x="0" y="0"/>
+                      <a:ext cx="3177815" cy="419136"/>
+                    </a:xfrm>
+                    <a:prstGeom prst="rect">
+                      <a:avLst/>
+                    </a:prstGeom>
+                  </pic:spPr>
+                </pic:pic>
+              </a:graphicData>
+            </a:graphic>
+          </wp:inline>
+        </w:drawing>
+      </w:r>
+    </w:p>
+    <w:p>
+      <w:pPr>
+        <w:pStyle w:val="ListParagraph"/>
+        <w:numPr>
+          <w:ilvl w:val="0"/>
+          <w:numId w:val="4"/>
+        </w:numPr>
+      </w:pPr>
+      <w:r>
+        <w:t>To allow password based remote login to Ubuntu system, edit /etc/ssh/sshd_config file</w:t>
+      </w:r>
+    </w:p>
+    <w:p>
+      <w:r>
+        <w:drawing>
+          <wp:inline distT="0" distB="0" distL="0" distR="0" wp14:anchorId="2B0B2731" wp14:editId="65EB51D9">
+            <wp:extent cx="2766300" cy="1120237"/>
+            <wp:effectExtent l="0" t="0" r="0" b="3810"/>
+            <wp:docPr id="1989049202" name="Picture 1"/>
+            <wp:cNvGraphicFramePr>
+              <a:graphicFrameLocks xmlns:a="http://schemas.openxmlformats.org/drawingml/2006/main" noChangeAspect="1"/>
+            </wp:cNvGraphicFramePr>
+            <a:graphic xmlns:a="http://schemas.openxmlformats.org/drawingml/2006/main">
+              <a:graphicData uri="http://schemas.openxmlformats.org/drawingml/2006/picture">
+                <pic:pic xmlns:pic="http://schemas.openxmlformats.org/drawingml/2006/picture">
+                  <pic:nvPicPr>
+                    <pic:cNvPr id="1989049202" name=""/>
+                    <pic:cNvPicPr/>
+                  </pic:nvPicPr>
+                  <pic:blipFill>
+                    <a:blip r:embed="rId10"/>
+                    <a:stretch>
+                      <a:fillRect/>
+                    </a:stretch>
+                  </pic:blipFill>
+                  <pic:spPr>
+                    <a:xfrm>
+                      <a:off x="0" y="0"/>
+                      <a:ext cx="2766300" cy="1120237"/>
+                    </a:xfrm>
+                    <a:prstGeom prst="rect">
+                      <a:avLst/>
+                    </a:prstGeom>
+                  </pic:spPr>
+                </pic:pic>
+              </a:graphicData>
+            </a:graphic>
+          </wp:inline>
+        </w:drawing>
+      </w:r>
+    </w:p>
+    <w:p>
+      <w:r>
+        <w:lastRenderedPageBreak/>
+        <w:t>Restart ssh</w:t>
+      </w:r>
+    </w:p>
+    <w:p>
+      <w:r>
+        <w:drawing>
+          <wp:inline distT="0" distB="0" distL="0" distR="0" wp14:anchorId="65F40C5A" wp14:editId="5E8AD081">
+            <wp:extent cx="2796782" cy="556308"/>
+            <wp:effectExtent l="0" t="0" r="3810" b="0"/>
+            <wp:docPr id="829240797" name="Picture 1"/>
+            <wp:cNvGraphicFramePr>
+              <a:graphicFrameLocks xmlns:a="http://schemas.openxmlformats.org/drawingml/2006/main" noChangeAspect="1"/>
+            </wp:cNvGraphicFramePr>
+            <a:graphic xmlns:a="http://schemas.openxmlformats.org/drawingml/2006/main">
+              <a:graphicData uri="http://schemas.openxmlformats.org/drawingml/2006/picture">
+                <pic:pic xmlns:pic="http://schemas.openxmlformats.org/drawingml/2006/picture">
+                  <pic:nvPicPr>
+                    <pic:cNvPr id="829240797" name=""/>
+                    <pic:cNvPicPr/>
+                  </pic:nvPicPr>
+                  <pic:blipFill>
+                    <a:blip r:embed="rId11"/>
+                    <a:stretch>
+                      <a:fillRect/>
+                    </a:stretch>
+                  </pic:blipFill>
+                  <pic:spPr>
+                    <a:xfrm>
+                      <a:off x="0" y="0"/>
+                      <a:ext cx="2796782" cy="556308"/>
+                    </a:xfrm>
+                    <a:prstGeom prst="rect">
+                      <a:avLst/>
+                    </a:prstGeom>
+                  </pic:spPr>
+                </pic:pic>
+              </a:graphicData>
+            </a:graphic>
+          </wp:inline>
+        </w:drawing>
+      </w:r>
+    </w:p>
+    <w:p>
+      <w:r>
+        <w:t>And now you’ll be able to ssh into web03 host from ‘scriptbox’ host</w:t>
+      </w:r>
+    </w:p>
+    <w:p>
+      <w:r>
+        <w:drawing>
+          <wp:inline distT="0" distB="0" distL="0" distR="0" wp14:anchorId="5227BD6C" wp14:editId="599AAA6E">
+            <wp:extent cx="3627434" cy="2484335"/>
+            <wp:effectExtent l="0" t="0" r="0" b="0"/>
+            <wp:docPr id="1662318144" name="Picture 1"/>
+            <wp:cNvGraphicFramePr>
+              <a:graphicFrameLocks xmlns:a="http://schemas.openxmlformats.org/drawingml/2006/main" noChangeAspect="1"/>
+            </wp:cNvGraphicFramePr>
+            <a:graphic xmlns:a="http://schemas.openxmlformats.org/drawingml/2006/main">
+              <a:graphicData uri="http://schemas.openxmlformats.org/drawingml/2006/picture">
+                <pic:pic xmlns:pic="http://schemas.openxmlformats.org/drawingml/2006/picture">
+                  <pic:nvPicPr>
+                    <pic:cNvPr id="1662318144" name=""/>
+                    <pic:cNvPicPr/>
+                  </pic:nvPicPr>
+                  <pic:blipFill>
+                    <a:blip r:embed="rId12"/>
+                    <a:stretch>
+                      <a:fillRect/>
+                    </a:stretch>
+                  </pic:blipFill>
+                  <pic:spPr>
+                    <a:xfrm>
+                      <a:off x="0" y="0"/>
+                      <a:ext cx="3627434" cy="2484335"/>
+                    </a:xfrm>
+                    <a:prstGeom prst="rect">
+                      <a:avLst/>
+                    </a:prstGeom>
+                  </pic:spPr>
+                </pic:pic>
+              </a:graphicData>
+            </a:graphic>
+          </wp:inline>
+        </w:drawing>
+      </w:r>
+    </w:p>
+    <w:p>
+      <w:pPr>
+        <w:pStyle w:val="ListParagraph"/>
+        <w:numPr>
+          <w:ilvl w:val="0"/>
+          <w:numId w:val="4"/>
+        </w:numPr>
+      </w:pPr>
+      <w:r>
+        <w:t>Add this user in sudoers file on Ubuntu</w:t>
+      </w:r>
+    </w:p>
+    <w:p>
+      <w:r>
+        <w:drawing>
+          <wp:inline distT="0" distB="0" distL="0" distR="0" wp14:anchorId="0D30D353" wp14:editId="2527C29D">
+            <wp:extent cx="2301439" cy="281964"/>
+            <wp:effectExtent l="0" t="0" r="3810" b="3810"/>
+            <wp:docPr id="1823236753" name="Picture 1"/>
+            <wp:cNvGraphicFramePr>
+              <a:graphicFrameLocks xmlns:a="http://schemas.openxmlformats.org/drawingml/2006/main" noChangeAspect="1"/>
+            </wp:cNvGraphicFramePr>
+            <a:graphic xmlns:a="http://schemas.openxmlformats.org/drawingml/2006/main">
+              <a:graphicData uri="http://schemas.openxmlformats.org/drawingml/2006/picture">
+                <pic:pic xmlns:pic="http://schemas.openxmlformats.org/drawingml/2006/picture">
+                  <pic:nvPicPr>
+                    <pic:cNvPr id="1823236753" name=""/>
+                    <pic:cNvPicPr/>
+                  </pic:nvPicPr>
+                  <pic:blipFill>
+                    <a:blip r:embed="rId13"/>
+                    <a:stretch>
+                      <a:fillRect/>
+                    </a:stretch>
+                  </pic:blipFill>
+                  <pic:spPr>
+                    <a:xfrm>
+                      <a:off x="0" y="0"/>
+                      <a:ext cx="2301439" cy="281964"/>
+                    </a:xfrm>
+                    <a:prstGeom prst="rect">
+                      <a:avLst/>
+                    </a:prstGeom>
+                  </pic:spPr>
+                </pic:pic>
+              </a:graphicData>
+            </a:graphic>
+          </wp:inline>
+        </w:drawing>
+      </w:r>
+    </w:p>
+    <w:p>
+      <w:r>
+        <w:drawing>
+          <wp:inline distT="0" distB="0" distL="0" distR="0" wp14:anchorId="20A30432" wp14:editId="28E4B23B">
+            <wp:extent cx="3772227" cy="777307"/>
+            <wp:effectExtent l="0" t="0" r="0" b="3810"/>
+            <wp:docPr id="571377839" name="Picture 1"/>
+            <wp:cNvGraphicFramePr>
+              <a:graphicFrameLocks xmlns:a="http://schemas.openxmlformats.org/drawingml/2006/main" noChangeAspect="1"/>
+            </wp:cNvGraphicFramePr>
+            <a:graphic xmlns:a="http://schemas.openxmlformats.org/drawingml/2006/main">
+              <a:graphicData uri="http://schemas.openxmlformats.org/drawingml/2006/picture">
+                <pic:pic xmlns:pic="http://schemas.openxmlformats.org/drawingml/2006/picture">
+                  <pic:nvPicPr>
+                    <pic:cNvPr id="571377839" name=""/>
+                    <pic:cNvPicPr/>
+                  </pic:nvPicPr>
+                  <pic:blipFill>
+                    <a:blip r:embed="rId14"/>
+                    <a:stretch>
+                      <a:fillRect/>
+                    </a:stretch>
+                  </pic:blipFill>
+                  <pic:spPr>
+                    <a:xfrm>
+                      <a:off x="0" y="0"/>
+                      <a:ext cx="3772227" cy="777307"/>
+                    </a:xfrm>
+                    <a:prstGeom prst="rect">
+                      <a:avLst/>
+                    </a:prstGeom>
+                  </pic:spPr>
+                </pic:pic>
+              </a:graphicData>
+            </a:graphic>
+          </wp:inline>
+        </w:drawing>
+      </w:r>
+    </w:p>
+    <w:p>
+      <w:pPr>
+        <w:pStyle w:val="ListParagraph"/>
+        <w:numPr>
+          <w:ilvl w:val="0"/>
+          <w:numId w:val="4"/>
+        </w:numPr>
+      </w:pPr>
+      <w:r>
+        <w:t>You can also execute any command on any host via ‘scriptbox’ using ssh command</w:t>
+      </w:r>
+    </w:p>
+    <w:p>
+      <w:r>
+        <w:drawing>
+          <wp:inline distT="0" distB="0" distL="0" distR="0" wp14:anchorId="0EA1E6C1" wp14:editId="741E27AB">
+            <wp:extent cx="4237087" cy="518205"/>
+            <wp:effectExtent l="0" t="0" r="0" b="0"/>
+            <wp:docPr id="1417846632" name="Picture 1"/>
+            <wp:cNvGraphicFramePr>
+              <a:graphicFrameLocks xmlns:a="http://schemas.openxmlformats.org/drawingml/2006/main" noChangeAspect="1"/>
+            </wp:cNvGraphicFramePr>
+            <a:graphic xmlns:a="http://schemas.openxmlformats.org/drawingml/2006/main">
+              <a:graphicData uri="http://schemas.openxmlformats.org/drawingml/2006/picture">
+                <pic:pic xmlns:pic="http://schemas.openxmlformats.org/drawingml/2006/picture">
+                  <pic:nvPicPr>
+                    <pic:cNvPr id="1417846632" name=""/>
+                    <pic:cNvPicPr/>
+                  </pic:nvPicPr>
+                  <pic:blipFill>
+                    <a:blip r:embed="rId15"/>
+                    <a:stretch>
+                      <a:fillRect/>
+                    </a:stretch>
+                  </pic:blipFill>
+                  <pic:spPr>
+                    <a:xfrm>
+                      <a:off x="0" y="0"/>
+                      <a:ext cx="4237087" cy="518205"/>
+                    </a:xfrm>
+                    <a:prstGeom prst="rect">
+                      <a:avLst/>
+                    </a:prstGeom>
+                  </pic:spPr>
+                </pic:pic>
+              </a:graphicData>
+            </a:graphic>
+          </wp:inline>
+        </w:drawing>
+      </w:r>
+    </w:p>
+    <w:p>
+      <w:pPr>
+        <w:pStyle w:val="ListParagraph"/>
+        <w:numPr>
+          <w:ilvl w:val="0"/>
+          <w:numId w:val="4"/>
+        </w:numPr>
+      </w:pPr>
+      <w:r>
+        <w:t>Generare ssh-keys which are stored in home-directory/.ssh/ of the logged in user</w:t>
+      </w:r>
+    </w:p>
+    <w:p>
+      <w:r>
+        <w:t>Root is the user here:</w:t>
+      </w:r>
+    </w:p>
+    <w:p>
+      <w:r>
+        <w:lastRenderedPageBreak/>
+        <w:drawing>
+          <wp:inline distT="0" distB="0" distL="0" distR="0" wp14:anchorId="39D125C5" wp14:editId="27A2B68F">
+            <wp:extent cx="4503810" cy="2987299"/>
+            <wp:effectExtent l="0" t="0" r="0" b="3810"/>
+            <wp:docPr id="1727662111" name="Picture 1"/>
+            <wp:cNvGraphicFramePr>
+              <a:graphicFrameLocks xmlns:a="http://schemas.openxmlformats.org/drawingml/2006/main" noChangeAspect="1"/>
+            </wp:cNvGraphicFramePr>
+            <a:graphic xmlns:a="http://schemas.openxmlformats.org/drawingml/2006/main">
+              <a:graphicData uri="http://schemas.openxmlformats.org/drawingml/2006/picture">
+                <pic:pic xmlns:pic="http://schemas.openxmlformats.org/drawingml/2006/picture">
+                  <pic:nvPicPr>
+                    <pic:cNvPr id="1727662111" name=""/>
+                    <pic:cNvPicPr/>
+                  </pic:nvPicPr>
+                  <pic:blipFill>
+                    <a:blip r:embed="rId16"/>
+                    <a:stretch>
+                      <a:fillRect/>
+                    </a:stretch>
+                  </pic:blipFill>
+                  <pic:spPr>
+                    <a:xfrm>
+                      <a:off x="0" y="0"/>
+                      <a:ext cx="4503810" cy="2987299"/>
+                    </a:xfrm>
+                    <a:prstGeom prst="rect">
+                      <a:avLst/>
+                    </a:prstGeom>
+                  </pic:spPr>
+                </pic:pic>
+              </a:graphicData>
+            </a:graphic>
+          </wp:inline>
+        </w:drawing>
+      </w:r>
+    </w:p>
+    <w:p>
+      <w:r>
+        <w:t>.pub is the public key</w:t>
+      </w:r>
+    </w:p>
+    <w:p>
+      <w:pPr>
+        <w:pStyle w:val="ListParagraph"/>
+        <w:numPr>
+          <w:ilvl w:val="0"/>
+          <w:numId w:val="4"/>
+        </w:numPr>
+      </w:pPr>
+      <w:r>
+        <w:t>Copy the public ssh-key to other hosts to allow key based remote connection</w:t>
+      </w:r>
+    </w:p>
+    <w:p>
+      <w:r>
+        <w:drawing>
+          <wp:inline distT="0" distB="0" distL="0" distR="0" wp14:anchorId="33610D56" wp14:editId="2D496A78">
+            <wp:extent cx="5502117" cy="1981372"/>
+            <wp:effectExtent l="0" t="0" r="3810" b="0"/>
+            <wp:docPr id="1666419497" name="Picture 1"/>
+            <wp:cNvGraphicFramePr>
+              <a:graphicFrameLocks xmlns:a="http://schemas.openxmlformats.org/drawingml/2006/main" noChangeAspect="1"/>
+            </wp:cNvGraphicFramePr>
+            <a:graphic xmlns:a="http://schemas.openxmlformats.org/drawingml/2006/main">
+              <a:graphicData uri="http://schemas.openxmlformats.org/drawingml/2006/picture">
+                <pic:pic xmlns:pic="http://schemas.openxmlformats.org/drawingml/2006/picture">
+                  <pic:nvPicPr>
+                    <pic:cNvPr id="1666419497" name=""/>
+                    <pic:cNvPicPr/>
+                  </pic:nvPicPr>
+                  <pic:blipFill>
+                    <a:blip r:embed="rId17"/>
+                    <a:stretch>
+                      <a:fillRect/>
+                    </a:stretch>
+                  </pic:blipFill>
+                  <pic:spPr>
+                    <a:xfrm>
+                      <a:off x="0" y="0"/>
+                      <a:ext cx="5502117" cy="1981372"/>
+                    </a:xfrm>
+                    <a:prstGeom prst="rect">
+                      <a:avLst/>
+                    </a:prstGeom>
+                  </pic:spPr>
+                </pic:pic>
+              </a:graphicData>
+            </a:graphic>
+          </wp:inline>
+        </w:drawing>
+      </w:r>
+    </w:p>
+    <w:p>
+      <w:pPr>
+        <w:pStyle w:val="ListParagraph"/>
+        <w:numPr>
+          <w:ilvl w:val="0"/>
+          <w:numId w:val="4"/>
+        </w:numPr>
+      </w:pPr>
+      <w:r>
+        <w:t>Remote command execution now will not ask for password</w:t>
+      </w:r>
+    </w:p>
+    <w:p>
+      <w:r>
+        <w:drawing>
+          <wp:inline distT="0" distB="0" distL="0" distR="0" wp14:anchorId="6D8D0A24" wp14:editId="56CB00FC">
+            <wp:extent cx="4237087" cy="426757"/>
+            <wp:effectExtent l="0" t="0" r="0" b="0"/>
+            <wp:docPr id="2145882064" name="Picture 1"/>
+            <wp:cNvGraphicFramePr>
+              <a:graphicFrameLocks xmlns:a="http://schemas.openxmlformats.org/drawingml/2006/main" noChangeAspect="1"/>
+            </wp:cNvGraphicFramePr>
+            <a:graphic xmlns:a="http://schemas.openxmlformats.org/drawingml/2006/main">
+              <a:graphicData uri="http://schemas.openxmlformats.org/drawingml/2006/picture">
+                <pic:pic xmlns:pic="http://schemas.openxmlformats.org/drawingml/2006/picture">
+                  <pic:nvPicPr>
+                    <pic:cNvPr id="2145882064" name=""/>
+                    <pic:cNvPicPr/>
+                  </pic:nvPicPr>
+                  <pic:blipFill>
+                    <a:blip r:embed="rId18"/>
+                    <a:stretch>
+                      <a:fillRect/>
+                    </a:stretch>
+                  </pic:blipFill>
+                  <pic:spPr>
+                    <a:xfrm>
+                      <a:off x="0" y="0"/>
+                      <a:ext cx="4237087" cy="426757"/>
+                    </a:xfrm>
+                    <a:prstGeom prst="rect">
+                      <a:avLst/>
+                    </a:prstGeom>
+                  </pic:spPr>
+                </pic:pic>
+              </a:graphicData>
+            </a:graphic>
+          </wp:inline>
+        </w:drawing>
+      </w:r>
+    </w:p>
+    <w:p>
+      <w:r>
+        <w:t>It uses the private key to login to remote host</w:t>
+      </w:r>
+    </w:p>
+    <w:p>
+      <w:pPr>
+        <w:rPr>
+          <w:b/>
+          <w:bCs/>
+          <w:sz w:val="24"/>
+          <w:szCs w:val="24"/>
+        </w:rPr>
+      </w:pPr>
+      <w:r>
+        <w:rPr>
+          <w:b/>
+          <w:bCs/>
+          <w:sz w:val="24"/>
+          <w:szCs w:val="24"/>
+        </w:rPr>
+        <w:t>Web Setup on Remote Hosts using Bash Script and SSH</w:t>
+      </w:r>
+    </w:p>
+    <w:p>
+      <w:pPr>
+        <w:pStyle w:val="ListParagraph"/>
+        <w:numPr>
+          <w:ilvl w:val="0"/>
+          <w:numId w:val="5"/>
+        </w:numPr>
+      </w:pPr>
+      <w:r>
+        <w:t>Create a file containing all the host names.</w:t>
+      </w:r>
+    </w:p>
+    <w:p>
+      <w:r>
+        <w:drawing>
+          <wp:inline distT="0" distB="0" distL="0" distR="0" wp14:anchorId="690D5C94" wp14:editId="40A57D58">
+            <wp:extent cx="594412" cy="464860"/>
+            <wp:effectExtent l="0" t="0" r="0" b="0"/>
+            <wp:docPr id="1495679489" name="Picture 1"/>
+            <wp:cNvGraphicFramePr>
+              <a:graphicFrameLocks xmlns:a="http://schemas.openxmlformats.org/drawingml/2006/main" noChangeAspect="1"/>
+            </wp:cNvGraphicFramePr>
+            <a:graphic xmlns:a="http://schemas.openxmlformats.org/drawingml/2006/main">
+              <a:graphicData uri="http://schemas.openxmlformats.org/drawingml/2006/picture">
+                <pic:pic xmlns:pic="http://schemas.openxmlformats.org/drawingml/2006/picture">
+                  <pic:nvPicPr>
+                    <pic:cNvPr id="1495679489" name=""/>
+                    <pic:cNvPicPr/>
+                  </pic:nvPicPr>
+                  <pic:blipFill>
+                    <a:blip r:embed="rId19"/>
+                    <a:stretch>
+                      <a:fillRect/>
+                    </a:stretch>
+                  </pic:blipFill>
+                  <pic:spPr>
+                    <a:xfrm>
+                      <a:off x="0" y="0"/>
+                      <a:ext cx="594412" cy="464860"/>
+                    </a:xfrm>
+                    <a:prstGeom prst="rect">
+                      <a:avLst/>
+                    </a:prstGeom>
+                  </pic:spPr>
+                </pic:pic>
+              </a:graphicData>
+            </a:graphic>
+          </wp:inline>
+        </w:drawing>
+      </w:r>
+    </w:p>
+    <w:p>
+      <w:r>
+        <w:t>Since we have already configured /etc/hosts file, these names will be resolved to their respective IP addresses</w:t>
+      </w:r>
+    </w:p>
+    <w:p>
+      <w:pPr>
+        <w:pStyle w:val="ListParagraph"/>
+        <w:numPr>
+          <w:ilvl w:val="0"/>
+          <w:numId w:val="5"/>
+        </w:numPr>
+      </w:pPr>
+      <w:r>
+        <w:t>Using for loop and command substitution to print the list above- stored in file ‘remhosts’</w:t>
+      </w:r>
+    </w:p>
+    <w:p>
+      <w:r>
+        <w:lastRenderedPageBreak/>
+        <w:drawing>
+          <wp:inline distT="0" distB="0" distL="0" distR="0" wp14:anchorId="24117E55" wp14:editId="4E2845A4">
+            <wp:extent cx="5502117" cy="807790"/>
+            <wp:effectExtent l="0" t="0" r="3810" b="0"/>
+            <wp:docPr id="1495786987" name="Picture 1"/>
+            <wp:cNvGraphicFramePr>
+              <a:graphicFrameLocks xmlns:a="http://schemas.openxmlformats.org/drawingml/2006/main" noChangeAspect="1"/>
+            </wp:cNvGraphicFramePr>
+            <a:graphic xmlns:a="http://schemas.openxmlformats.org/drawingml/2006/main">
+              <a:graphicData uri="http://schemas.openxmlformats.org/drawingml/2006/picture">
+                <pic:pic xmlns:pic="http://schemas.openxmlformats.org/drawingml/2006/picture">
+                  <pic:nvPicPr>
+                    <pic:cNvPr id="1495786987" name=""/>
+                    <pic:cNvPicPr/>
+                  </pic:nvPicPr>
+                  <pic:blipFill>
+                    <a:blip r:embed="rId20"/>
+                    <a:stretch>
+                      <a:fillRect/>
+                    </a:stretch>
+                  </pic:blipFill>
+                  <pic:spPr>
+                    <a:xfrm>
+                      <a:off x="0" y="0"/>
+                      <a:ext cx="5502117" cy="807790"/>
+                    </a:xfrm>
+                    <a:prstGeom prst="rect">
+                      <a:avLst/>
+                    </a:prstGeom>
+                  </pic:spPr>
+                </pic:pic>
+              </a:graphicData>
+            </a:graphic>
+          </wp:inline>
+        </w:drawing>
+      </w:r>
+    </w:p>
+    <w:p>
+      <w:pPr>
+        <w:pStyle w:val="ListParagraph"/>
+        <w:numPr>
+          <w:ilvl w:val="0"/>
+          <w:numId w:val="5"/>
+        </w:numPr>
+      </w:pPr>
+      <w:r>
+        <w:t>You can run ssh command in the same manner</w:t>
+      </w:r>
+    </w:p>
+    <w:p>
+      <w:r>
+        <w:drawing>
+          <wp:inline distT="0" distB="0" distL="0" distR="0" wp14:anchorId="58406AA5" wp14:editId="3A4815A2">
+            <wp:extent cx="5494496" cy="815411"/>
+            <wp:effectExtent l="0" t="0" r="0" b="3810"/>
+            <wp:docPr id="714159520" name="Picture 1"/>
+            <wp:cNvGraphicFramePr>
+              <a:graphicFrameLocks xmlns:a="http://schemas.openxmlformats.org/drawingml/2006/main" noChangeAspect="1"/>
+            </wp:cNvGraphicFramePr>
+            <a:graphic xmlns:a="http://schemas.openxmlformats.org/drawingml/2006/main">
+              <a:graphicData uri="http://schemas.openxmlformats.org/drawingml/2006/picture">
+                <pic:pic xmlns:pic="http://schemas.openxmlformats.org/drawingml/2006/picture">
+                  <pic:nvPicPr>
+                    <pic:cNvPr id="714159520" name=""/>
+                    <pic:cNvPicPr/>
+                  </pic:nvPicPr>
+                  <pic:blipFill>
+                    <a:blip r:embed="rId21"/>
+                    <a:stretch>
+                      <a:fillRect/>
+                    </a:stretch>
+                  </pic:blipFill>
+                  <pic:spPr>
+                    <a:xfrm>
+                      <a:off x="0" y="0"/>
+                      <a:ext cx="5494496" cy="815411"/>
+                    </a:xfrm>
+                    <a:prstGeom prst="rect">
+                      <a:avLst/>
+                    </a:prstGeom>
+                  </pic:spPr>
+                </pic:pic>
+              </a:graphicData>
+            </a:graphic>
+          </wp:inline>
+        </w:drawing>
+      </w:r>
+    </w:p>
+    <w:p>
+      <w:pPr>
+        <w:pStyle w:val="ListParagraph"/>
+        <w:numPr>
+          <w:ilvl w:val="0"/>
+          <w:numId w:val="5"/>
+        </w:numPr>
+      </w:pPr>
+      <w:r>
+        <w:t>Create bash script with following code</w:t>
+      </w:r>
+    </w:p>
+    <w:p>
+      <w:pPr>
+        <w:pStyle w:val="ListParagraph"/>
+        <w:numPr>
+          <w:ilvl w:val="0"/>
+          <w:numId w:val="5"/>
+        </w:numPr>
+        <w:autoSpaceDE w:val="0"/>
+        <w:autoSpaceDN w:val="0"/>
+        <w:adjustRightInd w:val="0"/>
+        <w:spacing w:after="0" w:line="240" w:lineRule="auto"/>
+        <w:rPr>
+          <w:rFonts w:ascii="Lucida Console" w:hAnsi="Lucida Console" w:cs="Lucida Console"/>
+          <w:color w:val="40FFFF"/>
+          <w:kern w:val="0"/>
+          <w:sz w:val="18"/>
+          <w:szCs w:val="18"/>
+        </w:rPr>
+      </w:pPr>
+      <w:r>
+        <w:rPr>
+          <w:rFonts w:ascii="Lucida Console" w:hAnsi="Lucida Console" w:cs="Lucida Console"/>
+          <w:color w:val="40FFFF"/>
+          <w:kern w:val="0"/>
+          <w:sz w:val="18"/>
+          <w:szCs w:val="18"/>
+        </w:rPr>
+        <w:t>#!/bin/bash</w:t>
+      </w:r>
+    </w:p>
+    <w:p>
+      <w:pPr>
+        <w:pStyle w:val="ListParagraph"/>
+        <w:numPr>
+          <w:ilvl w:val="0"/>
+          <w:numId w:val="5"/>
+        </w:numPr>
+        <w:autoSpaceDE w:val="0"/>
+        <w:autoSpaceDN w:val="0"/>
+        <w:adjustRightInd w:val="0"/>
+        <w:spacing w:after="0" w:line="240" w:lineRule="auto"/>
+        <w:rPr>
+          <w:rFonts w:ascii="Lucida Console" w:hAnsi="Lucida Console" w:cs="Lucida Console"/>
+          <w:color w:val="40FFFF"/>
+          <w:kern w:val="0"/>
+          <w:sz w:val="18"/>
+          <w:szCs w:val="18"/>
+        </w:rPr>
+      </w:pPr>
+    </w:p>
+    <w:p>
+      <w:pPr>
+        <w:pStyle w:val="ListParagraph"/>
+        <w:numPr>
+          <w:ilvl w:val="0"/>
+          <w:numId w:val="5"/>
+        </w:numPr>
+        <w:autoSpaceDE w:val="0"/>
+        <w:autoSpaceDN w:val="0"/>
+        <w:adjustRightInd w:val="0"/>
+        <w:spacing w:after="0" w:line="240" w:lineRule="auto"/>
+        <w:rPr>
+          <w:rFonts w:ascii="Lucida Console" w:hAnsi="Lucida Console" w:cs="Lucida Console"/>
+          <w:color w:val="40FFFF"/>
+          <w:kern w:val="0"/>
+          <w:sz w:val="18"/>
+          <w:szCs w:val="18"/>
+        </w:rPr>
+      </w:pPr>
+      <w:r>
+        <w:rPr>
+          <w:rFonts w:ascii="Lucida Console" w:hAnsi="Lucida Console" w:cs="Lucida Console"/>
+          <w:color w:val="40FFFF"/>
+          <w:kern w:val="0"/>
+          <w:sz w:val="18"/>
+          <w:szCs w:val="18"/>
+        </w:rPr>
+        <w:t># Variable Declaration</w:t>
+      </w:r>
+    </w:p>
+    <w:p>
+      <w:pPr>
+        <w:pStyle w:val="ListParagraph"/>
+        <w:numPr>
+          <w:ilvl w:val="0"/>
+          <w:numId w:val="5"/>
+        </w:numPr>
+        <w:autoSpaceDE w:val="0"/>
+        <w:autoSpaceDN w:val="0"/>
+        <w:adjustRightInd w:val="0"/>
+        <w:spacing w:after="0" w:line="240" w:lineRule="auto"/>
+        <w:rPr>
+          <w:rFonts w:ascii="Lucida Console" w:hAnsi="Lucida Console" w:cs="Lucida Console"/>
+          <w:color w:val="40FFFF"/>
+          <w:kern w:val="0"/>
+          <w:sz w:val="18"/>
+          <w:szCs w:val="18"/>
+        </w:rPr>
+      </w:pPr>
+      <w:r>
+        <w:rPr>
+          <w:rFonts w:ascii="Lucida Console" w:hAnsi="Lucida Console" w:cs="Lucida Console"/>
+          <w:color w:val="40FFFF"/>
+          <w:kern w:val="0"/>
+          <w:sz w:val="18"/>
+          <w:szCs w:val="18"/>
+        </w:rPr>
+        <w:t>#PACKAGE="httpd wget unzip"</w:t>
+      </w:r>
+    </w:p>
+    <w:p>
+      <w:pPr>
+        <w:pStyle w:val="ListParagraph"/>
+        <w:numPr>
+          <w:ilvl w:val="0"/>
+          <w:numId w:val="5"/>
+        </w:numPr>
+        <w:autoSpaceDE w:val="0"/>
+        <w:autoSpaceDN w:val="0"/>
+        <w:adjustRightInd w:val="0"/>
+        <w:spacing w:after="0" w:line="240" w:lineRule="auto"/>
+        <w:rPr>
+          <w:rFonts w:ascii="Lucida Console" w:hAnsi="Lucida Console" w:cs="Lucida Console"/>
+          <w:color w:val="40FFFF"/>
+          <w:kern w:val="0"/>
+          <w:sz w:val="18"/>
+          <w:szCs w:val="18"/>
+        </w:rPr>
+      </w:pPr>
+      <w:r>
+        <w:rPr>
+          <w:rFonts w:ascii="Lucida Console" w:hAnsi="Lucida Console" w:cs="Lucida Console"/>
+          <w:color w:val="40FFFF"/>
+          <w:kern w:val="0"/>
+          <w:sz w:val="18"/>
+          <w:szCs w:val="18"/>
+        </w:rPr>
+        <w:t>#SVC="httpd"</w:t>
+      </w:r>
+    </w:p>
+    <w:p>
+      <w:pPr>
+        <w:pStyle w:val="ListParagraph"/>
+        <w:numPr>
+          <w:ilvl w:val="0"/>
+          <w:numId w:val="5"/>
+        </w:numPr>
+        <w:autoSpaceDE w:val="0"/>
+        <w:autoSpaceDN w:val="0"/>
+        <w:adjustRightInd w:val="0"/>
+        <w:spacing w:after="0" w:line="240" w:lineRule="auto"/>
+        <w:rPr>
+          <w:rFonts w:ascii="Lucida Console" w:hAnsi="Lucida Console" w:cs="Lucida Console"/>
+          <w:color w:val="FFFF40"/>
+          <w:kern w:val="0"/>
+          <w:sz w:val="18"/>
+          <w:szCs w:val="18"/>
+        </w:rPr>
+      </w:pPr>
+      <w:r>
+        <w:rPr>
+          <w:rFonts w:ascii="Lucida Console" w:hAnsi="Lucida Console" w:cs="Lucida Console"/>
+          <w:color w:val="40FFFF"/>
+          <w:kern w:val="0"/>
+          <w:sz w:val="18"/>
+          <w:szCs w:val="18"/>
+        </w:rPr>
+        <w:t>URL</w:t>
+      </w:r>
+      <w:r>
+        <w:rPr>
+          <w:rFonts w:ascii="Lucida Console" w:hAnsi="Lucida Console" w:cs="Lucida Console"/>
+          <w:kern w:val="0"/>
+          <w:sz w:val="18"/>
+          <w:szCs w:val="18"/>
+        </w:rPr>
+        <w:t>=</w:t>
+      </w:r>
+      <w:r>
+        <w:rPr>
+          <w:rFonts w:ascii="Lucida Console" w:hAnsi="Lucida Console" w:cs="Lucida Console"/>
+          <w:color w:val="FFFF40"/>
+          <w:kern w:val="0"/>
+          <w:sz w:val="18"/>
+          <w:szCs w:val="18"/>
+        </w:rPr>
+        <w:t>'</w:t>
+      </w:r>
+      <w:r>
+        <w:rPr>
+          <w:rFonts w:ascii="Lucida Console" w:hAnsi="Lucida Console" w:cs="Lucida Console"/>
+          <w:color w:val="FF40FF"/>
+          <w:kern w:val="0"/>
+          <w:sz w:val="18"/>
+          <w:szCs w:val="18"/>
+        </w:rPr>
+        <w:t>https://www.tooplate.com/zip-templates/2098_health.zip</w:t>
+      </w:r>
+      <w:r>
+        <w:rPr>
+          <w:rFonts w:ascii="Lucida Console" w:hAnsi="Lucida Console" w:cs="Lucida Console"/>
+          <w:color w:val="FFFF40"/>
+          <w:kern w:val="0"/>
+          <w:sz w:val="18"/>
+          <w:szCs w:val="18"/>
+        </w:rPr>
+        <w:t>'</w:t>
+      </w:r>
+    </w:p>
+    <w:p>
+      <w:pPr>
+        <w:pStyle w:val="ListParagraph"/>
+        <w:numPr>
+          <w:ilvl w:val="0"/>
+          <w:numId w:val="5"/>
+        </w:numPr>
+        <w:autoSpaceDE w:val="0"/>
+        <w:autoSpaceDN w:val="0"/>
+        <w:adjustRightInd w:val="0"/>
+        <w:spacing w:after="0" w:line="240" w:lineRule="auto"/>
+        <w:rPr>
+          <w:rFonts w:ascii="Lucida Console" w:hAnsi="Lucida Console" w:cs="Lucida Console"/>
+          <w:color w:val="FFFF40"/>
+          <w:kern w:val="0"/>
+          <w:sz w:val="18"/>
+          <w:szCs w:val="18"/>
+        </w:rPr>
+      </w:pPr>
+      <w:r>
+        <w:rPr>
+          <w:rFonts w:ascii="Lucida Console" w:hAnsi="Lucida Console" w:cs="Lucida Console"/>
+          <w:color w:val="40FFFF"/>
+          <w:kern w:val="0"/>
+          <w:sz w:val="18"/>
+          <w:szCs w:val="18"/>
+        </w:rPr>
+        <w:t>ART_NAME</w:t>
+      </w:r>
+      <w:r>
+        <w:rPr>
+          <w:rFonts w:ascii="Lucida Console" w:hAnsi="Lucida Console" w:cs="Lucida Console"/>
+          <w:kern w:val="0"/>
+          <w:sz w:val="18"/>
+          <w:szCs w:val="18"/>
+        </w:rPr>
+        <w:t>=</w:t>
+      </w:r>
+      <w:r>
+        <w:rPr>
+          <w:rFonts w:ascii="Lucida Console" w:hAnsi="Lucida Console" w:cs="Lucida Console"/>
+          <w:color w:val="FFFF40"/>
+          <w:kern w:val="0"/>
+          <w:sz w:val="18"/>
+          <w:szCs w:val="18"/>
+        </w:rPr>
+        <w:t>'</w:t>
+      </w:r>
+      <w:r>
+        <w:rPr>
+          <w:rFonts w:ascii="Lucida Console" w:hAnsi="Lucida Console" w:cs="Lucida Console"/>
+          <w:color w:val="FF40FF"/>
+          <w:kern w:val="0"/>
+          <w:sz w:val="18"/>
+          <w:szCs w:val="18"/>
+        </w:rPr>
+        <w:t>2098_health</w:t>
+      </w:r>
+      <w:r>
+        <w:rPr>
+          <w:rFonts w:ascii="Lucida Console" w:hAnsi="Lucida Console" w:cs="Lucida Console"/>
+          <w:color w:val="FFFF40"/>
+          <w:kern w:val="0"/>
+          <w:sz w:val="18"/>
+          <w:szCs w:val="18"/>
+        </w:rPr>
+        <w:t>'</w:t>
+      </w:r>
+    </w:p>
+    <w:p>
+      <w:pPr>
+        <w:pStyle w:val="ListParagraph"/>
+        <w:numPr>
+          <w:ilvl w:val="0"/>
+          <w:numId w:val="5"/>
+        </w:numPr>
+        <w:autoSpaceDE w:val="0"/>
+        <w:autoSpaceDN w:val="0"/>
+        <w:adjustRightInd w:val="0"/>
+        <w:spacing w:after="0" w:line="240" w:lineRule="auto"/>
+        <w:rPr>
+          <w:rFonts w:ascii="Lucida Console" w:hAnsi="Lucida Console" w:cs="Lucida Console"/>
+          <w:color w:val="FFFF40"/>
+          <w:kern w:val="0"/>
+          <w:sz w:val="18"/>
+          <w:szCs w:val="18"/>
+        </w:rPr>
+      </w:pPr>
+      <w:r>
+        <w:rPr>
+          <w:rFonts w:ascii="Lucida Console" w:hAnsi="Lucida Console" w:cs="Lucida Console"/>
+          <w:color w:val="40FFFF"/>
+          <w:kern w:val="0"/>
+          <w:sz w:val="18"/>
+          <w:szCs w:val="18"/>
+        </w:rPr>
+        <w:t>TEMPDIR</w:t>
+      </w:r>
+      <w:r>
+        <w:rPr>
+          <w:rFonts w:ascii="Lucida Console" w:hAnsi="Lucida Console" w:cs="Lucida Console"/>
+          <w:kern w:val="0"/>
+          <w:sz w:val="18"/>
+          <w:szCs w:val="18"/>
+        </w:rPr>
+        <w:t>=</w:t>
+      </w:r>
+      <w:r>
+        <w:rPr>
+          <w:rFonts w:ascii="Lucida Console" w:hAnsi="Lucida Console" w:cs="Lucida Console"/>
+          <w:color w:val="FFFF40"/>
+          <w:kern w:val="0"/>
+          <w:sz w:val="18"/>
+          <w:szCs w:val="18"/>
+        </w:rPr>
+        <w:t>"</w:t>
+      </w:r>
+      <w:r>
+        <w:rPr>
+          <w:rFonts w:ascii="Lucida Console" w:hAnsi="Lucida Console" w:cs="Lucida Console"/>
+          <w:color w:val="FF40FF"/>
+          <w:kern w:val="0"/>
+          <w:sz w:val="18"/>
+          <w:szCs w:val="18"/>
+        </w:rPr>
+        <w:t>/tmp/webfiles</w:t>
+      </w:r>
+      <w:r>
+        <w:rPr>
+          <w:rFonts w:ascii="Lucida Console" w:hAnsi="Lucida Console" w:cs="Lucida Console"/>
+          <w:color w:val="FFFF40"/>
+          <w:kern w:val="0"/>
+          <w:sz w:val="18"/>
+          <w:szCs w:val="18"/>
+        </w:rPr>
+        <w:t>"</w:t>
+      </w:r>
+    </w:p>
+    <w:p>
+      <w:pPr>
+        <w:pStyle w:val="ListParagraph"/>
+        <w:numPr>
+          <w:ilvl w:val="0"/>
+          <w:numId w:val="5"/>
+        </w:numPr>
+        <w:autoSpaceDE w:val="0"/>
+        <w:autoSpaceDN w:val="0"/>
+        <w:adjustRightInd w:val="0"/>
+        <w:spacing w:after="0" w:line="240" w:lineRule="auto"/>
+        <w:rPr>
+          <w:rFonts w:ascii="Lucida Console" w:hAnsi="Lucida Console" w:cs="Lucida Console"/>
+          <w:color w:val="FFFF40"/>
+          <w:kern w:val="0"/>
+          <w:sz w:val="18"/>
+          <w:szCs w:val="18"/>
+        </w:rPr>
+      </w:pPr>
+    </w:p>
+    <w:p>
+      <w:pPr>
+        <w:pStyle w:val="ListParagraph"/>
+        <w:numPr>
+          <w:ilvl w:val="0"/>
+          <w:numId w:val="5"/>
+        </w:numPr>
+        <w:autoSpaceDE w:val="0"/>
+        <w:autoSpaceDN w:val="0"/>
+        <w:adjustRightInd w:val="0"/>
+        <w:spacing w:after="0" w:line="240" w:lineRule="auto"/>
+        <w:rPr>
+          <w:rFonts w:ascii="Lucida Console" w:hAnsi="Lucida Console" w:cs="Lucida Console"/>
+          <w:kern w:val="0"/>
+          <w:sz w:val="18"/>
+          <w:szCs w:val="18"/>
+        </w:rPr>
+      </w:pPr>
+      <w:r>
+        <w:rPr>
+          <w:rFonts w:ascii="Lucida Console" w:hAnsi="Lucida Console" w:cs="Lucida Console"/>
+          <w:kern w:val="0"/>
+          <w:sz w:val="18"/>
+          <w:szCs w:val="18"/>
+        </w:rPr>
+        <w:t xml:space="preserve">yum </w:t>
+      </w:r>
+      <w:r>
+        <w:rPr>
+          <w:rFonts w:ascii="Lucida Console" w:hAnsi="Lucida Console" w:cs="Lucida Console"/>
+          <w:color w:val="FF4040"/>
+          <w:kern w:val="0"/>
+          <w:sz w:val="18"/>
+          <w:szCs w:val="18"/>
+        </w:rPr>
+        <w:t>--help</w:t>
+      </w:r>
+      <w:r>
+        <w:rPr>
+          <w:rFonts w:ascii="Lucida Console" w:hAnsi="Lucida Console" w:cs="Lucida Console"/>
+          <w:kern w:val="0"/>
+          <w:sz w:val="18"/>
+          <w:szCs w:val="18"/>
+        </w:rPr>
+        <w:t xml:space="preserve"> &amp;</w:t>
+      </w:r>
+      <w:r>
+        <w:rPr>
+          <w:rFonts w:ascii="Lucida Console" w:hAnsi="Lucida Console" w:cs="Lucida Console"/>
+          <w:color w:val="FFFF40"/>
+          <w:kern w:val="0"/>
+          <w:sz w:val="18"/>
+          <w:szCs w:val="18"/>
+        </w:rPr>
+        <w:t>&gt;</w:t>
+      </w:r>
+      <w:r>
+        <w:rPr>
+          <w:rFonts w:ascii="Lucida Console" w:hAnsi="Lucida Console" w:cs="Lucida Console"/>
+          <w:kern w:val="0"/>
+          <w:sz w:val="18"/>
+          <w:szCs w:val="18"/>
+        </w:rPr>
+        <w:t xml:space="preserve"> /dev/null</w:t>
+      </w:r>
+    </w:p>
+    <w:p>
+      <w:pPr>
+        <w:pStyle w:val="ListParagraph"/>
+        <w:numPr>
+          <w:ilvl w:val="0"/>
+          <w:numId w:val="5"/>
+        </w:numPr>
+        <w:autoSpaceDE w:val="0"/>
+        <w:autoSpaceDN w:val="0"/>
+        <w:adjustRightInd w:val="0"/>
+        <w:spacing w:after="0" w:line="240" w:lineRule="auto"/>
+        <w:rPr>
+          <w:rFonts w:ascii="Lucida Console" w:hAnsi="Lucida Console" w:cs="Lucida Console"/>
+          <w:kern w:val="0"/>
+          <w:sz w:val="18"/>
+          <w:szCs w:val="18"/>
+        </w:rPr>
+      </w:pPr>
+    </w:p>
+    <w:p>
+      <w:pPr>
+        <w:pStyle w:val="ListParagraph"/>
+        <w:numPr>
+          <w:ilvl w:val="0"/>
+          <w:numId w:val="5"/>
+        </w:numPr>
+        <w:autoSpaceDE w:val="0"/>
+        <w:autoSpaceDN w:val="0"/>
+        <w:adjustRightInd w:val="0"/>
+        <w:spacing w:after="0" w:line="240" w:lineRule="auto"/>
+        <w:rPr>
+          <w:rFonts w:ascii="Lucida Console" w:hAnsi="Lucida Console" w:cs="Lucida Console"/>
+          <w:color w:val="FFFF40"/>
+          <w:kern w:val="0"/>
+          <w:sz w:val="18"/>
+          <w:szCs w:val="18"/>
+        </w:rPr>
+      </w:pPr>
+      <w:r>
+        <w:rPr>
+          <w:rFonts w:ascii="Lucida Console" w:hAnsi="Lucida Console" w:cs="Lucida Console"/>
+          <w:color w:val="FFFF40"/>
+          <w:kern w:val="0"/>
+          <w:sz w:val="18"/>
+          <w:szCs w:val="18"/>
+        </w:rPr>
+        <w:t>if [</w:t>
+      </w:r>
+      <w:r>
+        <w:rPr>
+          <w:rFonts w:ascii="Lucida Console" w:hAnsi="Lucida Console" w:cs="Lucida Console"/>
+          <w:kern w:val="0"/>
+          <w:sz w:val="18"/>
+          <w:szCs w:val="18"/>
+        </w:rPr>
+        <w:t xml:space="preserve"> </w:t>
+      </w:r>
+      <w:r>
+        <w:rPr>
+          <w:rFonts w:ascii="Lucida Console" w:hAnsi="Lucida Console" w:cs="Lucida Console"/>
+          <w:color w:val="6060FF"/>
+          <w:kern w:val="0"/>
+          <w:sz w:val="18"/>
+          <w:szCs w:val="18"/>
+        </w:rPr>
+        <w:t>$?</w:t>
+      </w:r>
+      <w:r>
+        <w:rPr>
+          <w:rFonts w:ascii="Lucida Console" w:hAnsi="Lucida Console" w:cs="Lucida Console"/>
+          <w:kern w:val="0"/>
+          <w:sz w:val="18"/>
+          <w:szCs w:val="18"/>
+        </w:rPr>
+        <w:t xml:space="preserve"> </w:t>
+      </w:r>
+      <w:r>
+        <w:rPr>
+          <w:rFonts w:ascii="Lucida Console" w:hAnsi="Lucida Console" w:cs="Lucida Console"/>
+          <w:color w:val="FFFF40"/>
+          <w:kern w:val="0"/>
+          <w:sz w:val="18"/>
+          <w:szCs w:val="18"/>
+        </w:rPr>
+        <w:t>-eq</w:t>
+      </w:r>
+      <w:r>
+        <w:rPr>
+          <w:rFonts w:ascii="Lucida Console" w:hAnsi="Lucida Console" w:cs="Lucida Console"/>
+          <w:kern w:val="0"/>
+          <w:sz w:val="18"/>
+          <w:szCs w:val="18"/>
+        </w:rPr>
+        <w:t xml:space="preserve"> </w:t>
+      </w:r>
+      <w:r>
+        <w:rPr>
+          <w:rFonts w:ascii="Lucida Console" w:hAnsi="Lucida Console" w:cs="Lucida Console"/>
+          <w:color w:val="FF40FF"/>
+          <w:kern w:val="0"/>
+          <w:sz w:val="18"/>
+          <w:szCs w:val="18"/>
+        </w:rPr>
+        <w:t>0</w:t>
+      </w:r>
+      <w:r>
+        <w:rPr>
+          <w:rFonts w:ascii="Lucida Console" w:hAnsi="Lucida Console" w:cs="Lucida Console"/>
+          <w:kern w:val="0"/>
+          <w:sz w:val="18"/>
+          <w:szCs w:val="18"/>
+        </w:rPr>
+        <w:t xml:space="preserve"> </w:t>
+      </w:r>
+      <w:r>
+        <w:rPr>
+          <w:rFonts w:ascii="Lucida Console" w:hAnsi="Lucida Console" w:cs="Lucida Console"/>
+          <w:color w:val="FFFF40"/>
+          <w:kern w:val="0"/>
+          <w:sz w:val="18"/>
+          <w:szCs w:val="18"/>
+        </w:rPr>
+        <w:t>]</w:t>
+      </w:r>
+    </w:p>
+    <w:p>
+      <w:pPr>
+        <w:pStyle w:val="ListParagraph"/>
+        <w:numPr>
+          <w:ilvl w:val="0"/>
+          <w:numId w:val="5"/>
+        </w:numPr>
+        <w:autoSpaceDE w:val="0"/>
+        <w:autoSpaceDN w:val="0"/>
+        <w:adjustRightInd w:val="0"/>
+        <w:spacing w:after="0" w:line="240" w:lineRule="auto"/>
+        <w:rPr>
+          <w:rFonts w:ascii="Lucida Console" w:hAnsi="Lucida Console" w:cs="Lucida Console"/>
+          <w:color w:val="FFFF40"/>
+          <w:kern w:val="0"/>
+          <w:sz w:val="18"/>
+          <w:szCs w:val="18"/>
+        </w:rPr>
+      </w:pPr>
+      <w:r>
+        <w:rPr>
+          <w:rFonts w:ascii="Lucida Console" w:hAnsi="Lucida Console" w:cs="Lucida Console"/>
+          <w:color w:val="FFFF40"/>
+          <w:kern w:val="0"/>
+          <w:sz w:val="18"/>
+          <w:szCs w:val="18"/>
+        </w:rPr>
+        <w:t>then</w:t>
+      </w:r>
+    </w:p>
+    <w:p>
+      <w:pPr>
+        <w:pStyle w:val="ListParagraph"/>
+        <w:numPr>
+          <w:ilvl w:val="0"/>
+          <w:numId w:val="5"/>
+        </w:numPr>
+        <w:autoSpaceDE w:val="0"/>
+        <w:autoSpaceDN w:val="0"/>
+        <w:adjustRightInd w:val="0"/>
+        <w:spacing w:after="0" w:line="240" w:lineRule="auto"/>
+        <w:rPr>
+          <w:rFonts w:ascii="Lucida Console" w:hAnsi="Lucida Console" w:cs="Lucida Console"/>
+          <w:color w:val="40FFFF"/>
+          <w:kern w:val="0"/>
+          <w:sz w:val="18"/>
+          <w:szCs w:val="18"/>
+        </w:rPr>
+      </w:pPr>
+      <w:r>
+        <w:rPr>
+          <w:rFonts w:ascii="Lucida Console" w:hAnsi="Lucida Console" w:cs="Lucida Console"/>
+          <w:kern w:val="0"/>
+          <w:sz w:val="18"/>
+          <w:szCs w:val="18"/>
+        </w:rPr>
+        <w:t xml:space="preserve">   </w:t>
+      </w:r>
+      <w:r>
+        <w:rPr>
+          <w:rFonts w:ascii="Lucida Console" w:hAnsi="Lucida Console" w:cs="Lucida Console"/>
+          <w:color w:val="40FFFF"/>
+          <w:kern w:val="0"/>
+          <w:sz w:val="18"/>
+          <w:szCs w:val="18"/>
+        </w:rPr>
+        <w:t># Set Variables for CentOS</w:t>
+      </w:r>
+    </w:p>
+    <w:p>
+      <w:pPr>
+        <w:pStyle w:val="ListParagraph"/>
+        <w:numPr>
+          <w:ilvl w:val="0"/>
+          <w:numId w:val="5"/>
+        </w:numPr>
+        <w:autoSpaceDE w:val="0"/>
+        <w:autoSpaceDN w:val="0"/>
+        <w:adjustRightInd w:val="0"/>
+        <w:spacing w:after="0" w:line="240" w:lineRule="auto"/>
+        <w:rPr>
+          <w:rFonts w:ascii="Lucida Console" w:hAnsi="Lucida Console" w:cs="Lucida Console"/>
+          <w:color w:val="FFFF40"/>
+          <w:kern w:val="0"/>
+          <w:sz w:val="18"/>
+          <w:szCs w:val="18"/>
+        </w:rPr>
+      </w:pPr>
+      <w:r>
+        <w:rPr>
+          <w:rFonts w:ascii="Lucida Console" w:hAnsi="Lucida Console" w:cs="Lucida Console"/>
+          <w:kern w:val="0"/>
+          <w:sz w:val="18"/>
+          <w:szCs w:val="18"/>
+        </w:rPr>
+        <w:t xml:space="preserve">   </w:t>
+      </w:r>
+      <w:r>
+        <w:rPr>
+          <w:rFonts w:ascii="Lucida Console" w:hAnsi="Lucida Console" w:cs="Lucida Console"/>
+          <w:color w:val="40FFFF"/>
+          <w:kern w:val="0"/>
+          <w:sz w:val="18"/>
+          <w:szCs w:val="18"/>
+        </w:rPr>
+        <w:t>PACKAGE</w:t>
+      </w:r>
+      <w:r>
+        <w:rPr>
+          <w:rFonts w:ascii="Lucida Console" w:hAnsi="Lucida Console" w:cs="Lucida Console"/>
+          <w:kern w:val="0"/>
+          <w:sz w:val="18"/>
+          <w:szCs w:val="18"/>
+        </w:rPr>
+        <w:t>=</w:t>
+      </w:r>
+      <w:r>
+        <w:rPr>
+          <w:rFonts w:ascii="Lucida Console" w:hAnsi="Lucida Console" w:cs="Lucida Console"/>
+          <w:color w:val="FFFF40"/>
+          <w:kern w:val="0"/>
+          <w:sz w:val="18"/>
+          <w:szCs w:val="18"/>
+        </w:rPr>
+        <w:t>"</w:t>
+      </w:r>
+      <w:r>
+        <w:rPr>
+          <w:rFonts w:ascii="Lucida Console" w:hAnsi="Lucida Console" w:cs="Lucida Console"/>
+          <w:color w:val="FF40FF"/>
+          <w:kern w:val="0"/>
+          <w:sz w:val="18"/>
+          <w:szCs w:val="18"/>
+        </w:rPr>
+        <w:t>httpd wget unzip</w:t>
+      </w:r>
+      <w:r>
+        <w:rPr>
+          <w:rFonts w:ascii="Lucida Console" w:hAnsi="Lucida Console" w:cs="Lucida Console"/>
+          <w:color w:val="FFFF40"/>
+          <w:kern w:val="0"/>
+          <w:sz w:val="18"/>
+          <w:szCs w:val="18"/>
+        </w:rPr>
+        <w:t>"</w:t>
+      </w:r>
+    </w:p>
+    <w:p>
+      <w:pPr>
+        <w:pStyle w:val="ListParagraph"/>
+        <w:numPr>
+          <w:ilvl w:val="0"/>
+          <w:numId w:val="5"/>
+        </w:numPr>
+        <w:autoSpaceDE w:val="0"/>
+        <w:autoSpaceDN w:val="0"/>
+        <w:adjustRightInd w:val="0"/>
+        <w:spacing w:after="0" w:line="240" w:lineRule="auto"/>
+        <w:rPr>
+          <w:rFonts w:ascii="Lucida Console" w:hAnsi="Lucida Console" w:cs="Lucida Console"/>
+          <w:color w:val="FFFF40"/>
+          <w:kern w:val="0"/>
+          <w:sz w:val="18"/>
+          <w:szCs w:val="18"/>
+        </w:rPr>
+      </w:pPr>
+      <w:r>
+        <w:rPr>
+          <w:rFonts w:ascii="Lucida Console" w:hAnsi="Lucida Console" w:cs="Lucida Console"/>
+          <w:kern w:val="0"/>
+          <w:sz w:val="18"/>
+          <w:szCs w:val="18"/>
+        </w:rPr>
+        <w:t xml:space="preserve">   </w:t>
+      </w:r>
+      <w:r>
+        <w:rPr>
+          <w:rFonts w:ascii="Lucida Console" w:hAnsi="Lucida Console" w:cs="Lucida Console"/>
+          <w:color w:val="40FFFF"/>
+          <w:kern w:val="0"/>
+          <w:sz w:val="18"/>
+          <w:szCs w:val="18"/>
+        </w:rPr>
+        <w:t>SVC</w:t>
+      </w:r>
+      <w:r>
+        <w:rPr>
+          <w:rFonts w:ascii="Lucida Console" w:hAnsi="Lucida Console" w:cs="Lucida Console"/>
+          <w:kern w:val="0"/>
+          <w:sz w:val="18"/>
+          <w:szCs w:val="18"/>
+        </w:rPr>
+        <w:t>=</w:t>
+      </w:r>
+      <w:r>
+        <w:rPr>
+          <w:rFonts w:ascii="Lucida Console" w:hAnsi="Lucida Console" w:cs="Lucida Console"/>
+          <w:color w:val="FFFF40"/>
+          <w:kern w:val="0"/>
+          <w:sz w:val="18"/>
+          <w:szCs w:val="18"/>
+        </w:rPr>
+        <w:t>"</w:t>
+      </w:r>
+      <w:r>
+        <w:rPr>
+          <w:rFonts w:ascii="Lucida Console" w:hAnsi="Lucida Console" w:cs="Lucida Console"/>
+          <w:color w:val="FF40FF"/>
+          <w:kern w:val="0"/>
+          <w:sz w:val="18"/>
+          <w:szCs w:val="18"/>
+        </w:rPr>
+        <w:t>httpd</w:t>
+      </w:r>
+      <w:r>
+        <w:rPr>
+          <w:rFonts w:ascii="Lucida Console" w:hAnsi="Lucida Console" w:cs="Lucida Console"/>
+          <w:color w:val="FFFF40"/>
+          <w:kern w:val="0"/>
+          <w:sz w:val="18"/>
+          <w:szCs w:val="18"/>
+        </w:rPr>
+        <w:t>"</w:t>
+      </w:r>
+    </w:p>
+    <w:p>
+      <w:pPr>
+        <w:pStyle w:val="ListParagraph"/>
+        <w:numPr>
+          <w:ilvl w:val="0"/>
+          <w:numId w:val="5"/>
+        </w:numPr>
+        <w:autoSpaceDE w:val="0"/>
+        <w:autoSpaceDN w:val="0"/>
+        <w:adjustRightInd w:val="0"/>
+        <w:spacing w:after="0" w:line="240" w:lineRule="auto"/>
+        <w:rPr>
+          <w:rFonts w:ascii="Lucida Console" w:hAnsi="Lucida Console" w:cs="Lucida Console"/>
+          <w:color w:val="FFFF40"/>
+          <w:kern w:val="0"/>
+          <w:sz w:val="18"/>
+          <w:szCs w:val="18"/>
+        </w:rPr>
+      </w:pPr>
+    </w:p>
+    <w:p>
+      <w:pPr>
+        <w:pStyle w:val="ListParagraph"/>
+        <w:numPr>
+          <w:ilvl w:val="0"/>
+          <w:numId w:val="5"/>
+        </w:numPr>
+        <w:autoSpaceDE w:val="0"/>
+        <w:autoSpaceDN w:val="0"/>
+        <w:adjustRightInd w:val="0"/>
+        <w:spacing w:after="0" w:line="240" w:lineRule="auto"/>
+        <w:rPr>
+          <w:rFonts w:ascii="Lucida Console" w:hAnsi="Lucida Console" w:cs="Lucida Console"/>
+          <w:color w:val="FFFF40"/>
+          <w:kern w:val="0"/>
+          <w:sz w:val="18"/>
+          <w:szCs w:val="18"/>
+        </w:rPr>
+      </w:pPr>
+      <w:r>
+        <w:rPr>
+          <w:rFonts w:ascii="Lucida Console" w:hAnsi="Lucida Console" w:cs="Lucida Console"/>
+          <w:kern w:val="0"/>
+          <w:sz w:val="18"/>
+          <w:szCs w:val="18"/>
+        </w:rPr>
+        <w:t xml:space="preserve">   </w:t>
+      </w:r>
+      <w:r>
+        <w:rPr>
+          <w:rFonts w:ascii="Lucida Console" w:hAnsi="Lucida Console" w:cs="Lucida Console"/>
+          <w:color w:val="FFFF40"/>
+          <w:kern w:val="0"/>
+          <w:sz w:val="18"/>
+          <w:szCs w:val="18"/>
+        </w:rPr>
+        <w:t>echo</w:t>
+      </w:r>
+      <w:r>
+        <w:rPr>
+          <w:rFonts w:ascii="Lucida Console" w:hAnsi="Lucida Console" w:cs="Lucida Console"/>
+          <w:color w:val="FF40FF"/>
+          <w:kern w:val="0"/>
+          <w:sz w:val="18"/>
+          <w:szCs w:val="18"/>
+        </w:rPr>
+        <w:t xml:space="preserve"> </w:t>
+      </w:r>
+      <w:r>
+        <w:rPr>
+          <w:rFonts w:ascii="Lucida Console" w:hAnsi="Lucida Console" w:cs="Lucida Console"/>
+          <w:color w:val="FFFF40"/>
+          <w:kern w:val="0"/>
+          <w:sz w:val="18"/>
+          <w:szCs w:val="18"/>
+        </w:rPr>
+        <w:t>"</w:t>
+      </w:r>
+      <w:r>
+        <w:rPr>
+          <w:rFonts w:ascii="Lucida Console" w:hAnsi="Lucida Console" w:cs="Lucida Console"/>
+          <w:color w:val="FF40FF"/>
+          <w:kern w:val="0"/>
+          <w:sz w:val="18"/>
+          <w:szCs w:val="18"/>
+        </w:rPr>
+        <w:t>Running Setup on CentOS</w:t>
+      </w:r>
+      <w:r>
+        <w:rPr>
+          <w:rFonts w:ascii="Lucida Console" w:hAnsi="Lucida Console" w:cs="Lucida Console"/>
+          <w:color w:val="FFFF40"/>
+          <w:kern w:val="0"/>
+          <w:sz w:val="18"/>
+          <w:szCs w:val="18"/>
+        </w:rPr>
+        <w:t>"</w:t>
+      </w:r>
+    </w:p>
+    <w:p>
+      <w:pPr>
+        <w:pStyle w:val="ListParagraph"/>
+        <w:numPr>
+          <w:ilvl w:val="0"/>
+          <w:numId w:val="5"/>
+        </w:numPr>
+        <w:autoSpaceDE w:val="0"/>
+        <w:autoSpaceDN w:val="0"/>
+        <w:adjustRightInd w:val="0"/>
+        <w:spacing w:after="0" w:line="240" w:lineRule="auto"/>
+        <w:rPr>
+          <w:rFonts w:ascii="Lucida Console" w:hAnsi="Lucida Console" w:cs="Lucida Console"/>
+          <w:color w:val="40FFFF"/>
+          <w:kern w:val="0"/>
+          <w:sz w:val="18"/>
+          <w:szCs w:val="18"/>
+        </w:rPr>
+      </w:pPr>
+      <w:r>
+        <w:rPr>
+          <w:rFonts w:ascii="Lucida Console" w:hAnsi="Lucida Console" w:cs="Lucida Console"/>
+          <w:kern w:val="0"/>
+          <w:sz w:val="18"/>
+          <w:szCs w:val="18"/>
+        </w:rPr>
+        <w:t xml:space="preserve">   </w:t>
+      </w:r>
+      <w:r>
+        <w:rPr>
+          <w:rFonts w:ascii="Lucida Console" w:hAnsi="Lucida Console" w:cs="Lucida Console"/>
+          <w:color w:val="40FFFF"/>
+          <w:kern w:val="0"/>
+          <w:sz w:val="18"/>
+          <w:szCs w:val="18"/>
+        </w:rPr>
+        <w:t># Installing Dependencies</w:t>
+      </w:r>
+    </w:p>
+    <w:p>
+      <w:pPr>
+        <w:pStyle w:val="ListParagraph"/>
+        <w:numPr>
+          <w:ilvl w:val="0"/>
+          <w:numId w:val="5"/>
+        </w:numPr>
+        <w:autoSpaceDE w:val="0"/>
+        <w:autoSpaceDN w:val="0"/>
+        <w:adjustRightInd w:val="0"/>
+        <w:spacing w:after="0" w:line="240" w:lineRule="auto"/>
+        <w:rPr>
+          <w:rFonts w:ascii="Lucida Console" w:hAnsi="Lucida Console" w:cs="Lucida Console"/>
+          <w:color w:val="FFFF40"/>
+          <w:kern w:val="0"/>
+          <w:sz w:val="18"/>
+          <w:szCs w:val="18"/>
+        </w:rPr>
+      </w:pPr>
+      <w:r>
+        <w:rPr>
+          <w:rFonts w:ascii="Lucida Console" w:hAnsi="Lucida Console" w:cs="Lucida Console"/>
+          <w:kern w:val="0"/>
+          <w:sz w:val="18"/>
+          <w:szCs w:val="18"/>
+        </w:rPr>
+        <w:t xml:space="preserve">   </w:t>
+      </w:r>
+      <w:r>
+        <w:rPr>
+          <w:rFonts w:ascii="Lucida Console" w:hAnsi="Lucida Console" w:cs="Lucida Console"/>
+          <w:color w:val="FFFF40"/>
+          <w:kern w:val="0"/>
+          <w:sz w:val="18"/>
+          <w:szCs w:val="18"/>
+        </w:rPr>
+        <w:t>echo</w:t>
+      </w:r>
+      <w:r>
+        <w:rPr>
+          <w:rFonts w:ascii="Lucida Console" w:hAnsi="Lucida Console" w:cs="Lucida Console"/>
+          <w:color w:val="FF40FF"/>
+          <w:kern w:val="0"/>
+          <w:sz w:val="18"/>
+          <w:szCs w:val="18"/>
+        </w:rPr>
+        <w:t xml:space="preserve"> </w:t>
+      </w:r>
+      <w:r>
+        <w:rPr>
+          <w:rFonts w:ascii="Lucida Console" w:hAnsi="Lucida Console" w:cs="Lucida Console"/>
+          <w:color w:val="FFFF40"/>
+          <w:kern w:val="0"/>
+          <w:sz w:val="18"/>
+          <w:szCs w:val="18"/>
+        </w:rPr>
+        <w:t>"</w:t>
+      </w:r>
+      <w:r>
+        <w:rPr>
+          <w:rFonts w:ascii="Lucida Console" w:hAnsi="Lucida Console" w:cs="Lucida Console"/>
+          <w:color w:val="FF40FF"/>
+          <w:kern w:val="0"/>
+          <w:sz w:val="18"/>
+          <w:szCs w:val="18"/>
+        </w:rPr>
+        <w:t>########################################</w:t>
+      </w:r>
+      <w:r>
+        <w:rPr>
+          <w:rFonts w:ascii="Lucida Console" w:hAnsi="Lucida Console" w:cs="Lucida Console"/>
+          <w:color w:val="FFFF40"/>
+          <w:kern w:val="0"/>
+          <w:sz w:val="18"/>
+          <w:szCs w:val="18"/>
+        </w:rPr>
+        <w:t>"</w:t>
+      </w:r>
+    </w:p>
+    <w:p>
+      <w:pPr>
+        <w:pStyle w:val="ListParagraph"/>
+        <w:numPr>
+          <w:ilvl w:val="0"/>
+          <w:numId w:val="5"/>
+        </w:numPr>
+        <w:autoSpaceDE w:val="0"/>
+        <w:autoSpaceDN w:val="0"/>
+        <w:adjustRightInd w:val="0"/>
+        <w:spacing w:after="0" w:line="240" w:lineRule="auto"/>
+        <w:rPr>
+          <w:rFonts w:ascii="Lucida Console" w:hAnsi="Lucida Console" w:cs="Lucida Console"/>
+          <w:color w:val="FFFF40"/>
+          <w:kern w:val="0"/>
+          <w:sz w:val="18"/>
+          <w:szCs w:val="18"/>
+        </w:rPr>
+      </w:pPr>
+      <w:r>
+        <w:rPr>
+          <w:rFonts w:ascii="Lucida Console" w:hAnsi="Lucida Console" w:cs="Lucida Console"/>
+          <w:kern w:val="0"/>
+          <w:sz w:val="18"/>
+          <w:szCs w:val="18"/>
+        </w:rPr>
+        <w:t xml:space="preserve">   </w:t>
+      </w:r>
+      <w:r>
+        <w:rPr>
+          <w:rFonts w:ascii="Lucida Console" w:hAnsi="Lucida Console" w:cs="Lucida Console"/>
+          <w:color w:val="FFFF40"/>
+          <w:kern w:val="0"/>
+          <w:sz w:val="18"/>
+          <w:szCs w:val="18"/>
+        </w:rPr>
+        <w:t>echo</w:t>
+      </w:r>
+      <w:r>
+        <w:rPr>
+          <w:rFonts w:ascii="Lucida Console" w:hAnsi="Lucida Console" w:cs="Lucida Console"/>
+          <w:color w:val="FF40FF"/>
+          <w:kern w:val="0"/>
+          <w:sz w:val="18"/>
+          <w:szCs w:val="18"/>
+        </w:rPr>
+        <w:t xml:space="preserve"> </w:t>
+      </w:r>
+      <w:r>
+        <w:rPr>
+          <w:rFonts w:ascii="Lucida Console" w:hAnsi="Lucida Console" w:cs="Lucida Console"/>
+          <w:color w:val="FFFF40"/>
+          <w:kern w:val="0"/>
+          <w:sz w:val="18"/>
+          <w:szCs w:val="18"/>
+        </w:rPr>
+        <w:t>"</w:t>
+      </w:r>
+      <w:r>
+        <w:rPr>
+          <w:rFonts w:ascii="Lucida Console" w:hAnsi="Lucida Console" w:cs="Lucida Console"/>
+          <w:color w:val="FF40FF"/>
+          <w:kern w:val="0"/>
+          <w:sz w:val="18"/>
+          <w:szCs w:val="18"/>
+        </w:rPr>
+        <w:t>Installing packages.</w:t>
+      </w:r>
+      <w:r>
+        <w:rPr>
+          <w:rFonts w:ascii="Lucida Console" w:hAnsi="Lucida Console" w:cs="Lucida Console"/>
+          <w:color w:val="FFFF40"/>
+          <w:kern w:val="0"/>
+          <w:sz w:val="18"/>
+          <w:szCs w:val="18"/>
+        </w:rPr>
+        <w:t>"</w:t>
+      </w:r>
+    </w:p>
+    <w:p>
+      <w:pPr>
+        <w:pStyle w:val="ListParagraph"/>
+        <w:numPr>
+          <w:ilvl w:val="0"/>
+          <w:numId w:val="5"/>
+        </w:numPr>
+        <w:autoSpaceDE w:val="0"/>
+        <w:autoSpaceDN w:val="0"/>
+        <w:adjustRightInd w:val="0"/>
+        <w:spacing w:after="0" w:line="240" w:lineRule="auto"/>
+        <w:rPr>
+          <w:rFonts w:ascii="Lucida Console" w:hAnsi="Lucida Console" w:cs="Lucida Console"/>
+          <w:color w:val="FFFF40"/>
+          <w:kern w:val="0"/>
+          <w:sz w:val="18"/>
+          <w:szCs w:val="18"/>
+        </w:rPr>
+      </w:pPr>
+      <w:r>
+        <w:rPr>
+          <w:rFonts w:ascii="Lucida Console" w:hAnsi="Lucida Console" w:cs="Lucida Console"/>
+          <w:kern w:val="0"/>
+          <w:sz w:val="18"/>
+          <w:szCs w:val="18"/>
+        </w:rPr>
+        <w:t xml:space="preserve">   </w:t>
+      </w:r>
+      <w:r>
+        <w:rPr>
+          <w:rFonts w:ascii="Lucida Console" w:hAnsi="Lucida Console" w:cs="Lucida Console"/>
+          <w:color w:val="FFFF40"/>
+          <w:kern w:val="0"/>
+          <w:sz w:val="18"/>
+          <w:szCs w:val="18"/>
+        </w:rPr>
+        <w:t>echo</w:t>
+      </w:r>
+      <w:r>
+        <w:rPr>
+          <w:rFonts w:ascii="Lucida Console" w:hAnsi="Lucida Console" w:cs="Lucida Console"/>
+          <w:color w:val="FF40FF"/>
+          <w:kern w:val="0"/>
+          <w:sz w:val="18"/>
+          <w:szCs w:val="18"/>
+        </w:rPr>
+        <w:t xml:space="preserve"> </w:t>
+      </w:r>
+      <w:r>
+        <w:rPr>
+          <w:rFonts w:ascii="Lucida Console" w:hAnsi="Lucida Console" w:cs="Lucida Console"/>
+          <w:color w:val="FFFF40"/>
+          <w:kern w:val="0"/>
+          <w:sz w:val="18"/>
+          <w:szCs w:val="18"/>
+        </w:rPr>
+        <w:t>"</w:t>
+      </w:r>
+      <w:r>
+        <w:rPr>
+          <w:rFonts w:ascii="Lucida Console" w:hAnsi="Lucida Console" w:cs="Lucida Console"/>
+          <w:color w:val="FF40FF"/>
+          <w:kern w:val="0"/>
+          <w:sz w:val="18"/>
+          <w:szCs w:val="18"/>
+        </w:rPr>
+        <w:t>########################################</w:t>
+      </w:r>
+      <w:r>
+        <w:rPr>
+          <w:rFonts w:ascii="Lucida Console" w:hAnsi="Lucida Console" w:cs="Lucida Console"/>
+          <w:color w:val="FFFF40"/>
+          <w:kern w:val="0"/>
+          <w:sz w:val="18"/>
+          <w:szCs w:val="18"/>
+        </w:rPr>
+        <w:t>"</w:t>
+      </w:r>
+    </w:p>
+    <w:p>
+      <w:pPr>
+        <w:pStyle w:val="ListParagraph"/>
+        <w:numPr>
+          <w:ilvl w:val="0"/>
+          <w:numId w:val="5"/>
+        </w:numPr>
+        <w:autoSpaceDE w:val="0"/>
+        <w:autoSpaceDN w:val="0"/>
+        <w:adjustRightInd w:val="0"/>
+        <w:spacing w:after="0" w:line="240" w:lineRule="auto"/>
+        <w:rPr>
+          <w:rFonts w:ascii="Lucida Console" w:hAnsi="Lucida Console" w:cs="Lucida Console"/>
+          <w:kern w:val="0"/>
+          <w:sz w:val="18"/>
+          <w:szCs w:val="18"/>
+        </w:rPr>
+      </w:pPr>
+      <w:r>
+        <w:rPr>
+          <w:rFonts w:ascii="Lucida Console" w:hAnsi="Lucida Console" w:cs="Lucida Console"/>
+          <w:kern w:val="0"/>
+          <w:sz w:val="18"/>
+          <w:szCs w:val="18"/>
+        </w:rPr>
+        <w:t xml:space="preserve">   sudo yum install </w:t>
+      </w:r>
+      <w:r>
+        <w:rPr>
+          <w:rFonts w:ascii="Lucida Console" w:hAnsi="Lucida Console" w:cs="Lucida Console"/>
+          <w:color w:val="6060FF"/>
+          <w:kern w:val="0"/>
+          <w:sz w:val="18"/>
+          <w:szCs w:val="18"/>
+        </w:rPr>
+        <w:t>$PACKAGE</w:t>
+      </w:r>
+      <w:r>
+        <w:rPr>
+          <w:rFonts w:ascii="Lucida Console" w:hAnsi="Lucida Console" w:cs="Lucida Console"/>
+          <w:kern w:val="0"/>
+          <w:sz w:val="18"/>
+          <w:szCs w:val="18"/>
+        </w:rPr>
+        <w:t xml:space="preserve"> </w:t>
+      </w:r>
+      <w:r>
+        <w:rPr>
+          <w:rFonts w:ascii="Lucida Console" w:hAnsi="Lucida Console" w:cs="Lucida Console"/>
+          <w:color w:val="FFFF40"/>
+          <w:kern w:val="0"/>
+          <w:sz w:val="18"/>
+          <w:szCs w:val="18"/>
+        </w:rPr>
+        <w:t>-y</w:t>
+      </w:r>
+      <w:r>
+        <w:rPr>
+          <w:rFonts w:ascii="Lucida Console" w:hAnsi="Lucida Console" w:cs="Lucida Console"/>
+          <w:kern w:val="0"/>
+          <w:sz w:val="18"/>
+          <w:szCs w:val="18"/>
+        </w:rPr>
+        <w:t xml:space="preserve"> </w:t>
+      </w:r>
+      <w:r>
+        <w:rPr>
+          <w:rFonts w:ascii="Lucida Console" w:hAnsi="Lucida Console" w:cs="Lucida Console"/>
+          <w:color w:val="FFFF40"/>
+          <w:kern w:val="0"/>
+          <w:sz w:val="18"/>
+          <w:szCs w:val="18"/>
+        </w:rPr>
+        <w:t>&gt;</w:t>
+      </w:r>
+      <w:r>
+        <w:rPr>
+          <w:rFonts w:ascii="Lucida Console" w:hAnsi="Lucida Console" w:cs="Lucida Console"/>
+          <w:kern w:val="0"/>
+          <w:sz w:val="18"/>
+          <w:szCs w:val="18"/>
+        </w:rPr>
+        <w:t xml:space="preserve"> /dev/null</w:t>
+      </w:r>
+    </w:p>
+    <w:p>
+      <w:pPr>
+        <w:ind w:left="360"/>
+        <w:rPr>
+          <w:rFonts w:ascii="Lucida Console" w:hAnsi="Lucida Console" w:cs="Lucida Console"/>
+          <w:kern w:val="0"/>
+          <w:sz w:val="18"/>
+          <w:szCs w:val="18"/>
+        </w:rPr>
+      </w:pPr>
+    </w:p>
+    <w:p>
+      <w:pPr>
+        <w:ind w:left="360"/>
+        <w:rPr>
+          <w:rFonts w:cstheme="minorHAnsi"/>
+          <w:kern w:val="0"/>
+        </w:rPr>
+      </w:pPr>
+      <w:r>
+        <w:rPr>
+          <w:rFonts w:cstheme="minorHAnsi"/>
+          <w:kern w:val="0"/>
+        </w:rPr>
+        <w:t>In this code, we are checking exit code of the yum –help command to check if the OS is CentOS. And for Ubuntu OS we the code starts in ‘else’ part of the if block</w:t>
+      </w:r>
+    </w:p>
+    <w:p>
+      <w:pPr>
+        <w:pStyle w:val="ListParagraph"/>
+        <w:numPr>
+          <w:ilvl w:val="0"/>
+          <w:numId w:val="2"/>
+        </w:numPr>
+        <w:rPr>
+          <w:rFonts w:cstheme="minorHAnsi"/>
+          <w:kern w:val="0"/>
+        </w:rPr>
+      </w:pPr>
+      <w:r>
+        <w:rPr>
+          <w:rFonts w:ascii="Lucida Console" w:hAnsi="Lucida Console" w:cs="Lucida Console"/>
+          <w:kern w:val="0"/>
+          <w:sz w:val="18"/>
+          <w:szCs w:val="18"/>
+        </w:rPr>
+        <w:t>T</w:t>
+      </w:r>
+      <w:r>
+        <w:rPr>
+          <w:rFonts w:cstheme="minorHAnsi"/>
+          <w:kern w:val="0"/>
+        </w:rPr>
+        <w:t>est the bash script on ‘scriptbox’ VM</w:t>
+      </w:r>
+    </w:p>
+    <w:p>
+      <w:pPr>
+        <w:rPr>
+          <w:rFonts w:ascii="Lucida Console" w:hAnsi="Lucida Console" w:cs="Lucida Console"/>
+          <w:kern w:val="0"/>
+          <w:sz w:val="18"/>
+          <w:szCs w:val="18"/>
+        </w:rPr>
+      </w:pPr>
+      <w:r>
+        <w:rPr>
+          <w:rFonts w:ascii="Lucida Console" w:hAnsi="Lucida Console" w:cs="Lucida Console"/>
+          <w:kern w:val="0"/>
+          <w:sz w:val="18"/>
+          <w:szCs w:val="18"/>
+        </w:rPr>
+        <w:lastRenderedPageBreak/>
+        <w:drawing>
+          <wp:inline distT="0" distB="0" distL="0" distR="0" wp14:anchorId="30C18929" wp14:editId="0BB7C8D5">
+            <wp:extent cx="5540220" cy="5692633"/>
+            <wp:effectExtent l="0" t="0" r="3810" b="3810"/>
+            <wp:docPr id="1171286892" name="Picture 1"/>
+            <wp:cNvGraphicFramePr>
+              <a:graphicFrameLocks xmlns:a="http://schemas.openxmlformats.org/drawingml/2006/main" noChangeAspect="1"/>
+            </wp:cNvGraphicFramePr>
+            <a:graphic xmlns:a="http://schemas.openxmlformats.org/drawingml/2006/main">
+              <a:graphicData uri="http://schemas.openxmlformats.org/drawingml/2006/picture">
+                <pic:pic xmlns:pic="http://schemas.openxmlformats.org/drawingml/2006/picture">
+                  <pic:nvPicPr>
+                    <pic:cNvPr id="1171286892" name=""/>
+                    <pic:cNvPicPr/>
+                  </pic:nvPicPr>
+                  <pic:blipFill>
+                    <a:blip r:embed="rId22"/>
+                    <a:stretch>
+                      <a:fillRect/>
+                    </a:stretch>
+                  </pic:blipFill>
+                  <pic:spPr>
+                    <a:xfrm>
+                      <a:off x="0" y="0"/>
+                      <a:ext cx="5540220" cy="5692633"/>
+                    </a:xfrm>
+                    <a:prstGeom prst="rect">
+                      <a:avLst/>
+                    </a:prstGeom>
+                  </pic:spPr>
+                </pic:pic>
+              </a:graphicData>
+            </a:graphic>
+          </wp:inline>
+        </w:drawing>
+      </w:r>
+      <w:r>
+        <w:rPr>
+          <w:rFonts w:ascii="Lucida Console" w:hAnsi="Lucida Console" w:cs="Lucida Console"/>
+          <w:kern w:val="0"/>
+          <w:sz w:val="18"/>
+          <w:szCs w:val="18"/>
+        </w:rPr>
+        <w:t xml:space="preserve">   </w:t>
+      </w:r>
+    </w:p>
+    <w:p>
+      <w:pPr>
+        <w:pStyle w:val="ListParagraph"/>
+        <w:numPr>
+          <w:ilvl w:val="0"/>
+          <w:numId w:val="2"/>
+        </w:numPr>
+        <w:rPr>
+          <w:rFonts w:cstheme="minorHAnsi"/>
+          <w:sz w:val="28"/>
+          <w:szCs w:val="28"/>
+        </w:rPr>
+      </w:pPr>
+      <w:r>
+        <w:rPr>
+          <w:rFonts w:cstheme="minorHAnsi"/>
+          <w:kern w:val="0"/>
+        </w:rPr>
+        <w:t>We will use ‘scp’ command to push multios_websetup.sh file to remote hosts</w:t>
+      </w:r>
+    </w:p>
+    <w:p>
+      <w:pPr>
+        <w:rPr>
+          <w:rFonts w:cstheme="minorHAnsi"/>
+          <w:kern w:val="0"/>
+        </w:rPr>
+      </w:pPr>
+      <w:r>
+        <w:rPr>
+          <w:rFonts w:cstheme="minorHAnsi"/>
+          <w:kern w:val="0"/>
+        </w:rPr>
+        <w:t>The scp (secure copy) command is a command-line utility used to </w:t>
+      </w:r>
+      <w:r>
+        <w:rPr>
+          <w:rFonts w:cstheme="minorHAnsi"/>
+          <w:b/>
+          <w:bCs/>
+          <w:kern w:val="0"/>
+        </w:rPr>
+        <w:t>securely transfer files and directories</w:t>
+      </w:r>
+      <w:r>
+        <w:rPr>
+          <w:rFonts w:cstheme="minorHAnsi"/>
+          <w:kern w:val="0"/>
+        </w:rPr>
+        <w:t> between local and remote systems, or between two remote systems. It uses the SSH (Secure Shell) protocol for authentication and encryption, ensuring data confidentiality during transit.</w:t>
+      </w:r>
+      <w:r>
+        <w:rPr>
+          <w:rFonts w:cstheme="minorHAnsi"/>
+          <w:kern w:val="0"/>
+        </w:rPr>
+        <w:t xml:space="preserve">                   </w:t>
+      </w:r>
+    </w:p>
+    <w:p>
+      <w:pPr>
+        <w:pStyle w:val="ListParagraph"/>
+        <w:numPr>
+          <w:ilvl w:val="0"/>
+          <w:numId w:val="2"/>
+        </w:numPr>
+        <w:rPr>
+          <w:rFonts w:cstheme="minorHAnsi"/>
+          <w:kern w:val="0"/>
+        </w:rPr>
+      </w:pPr>
+      <w:r>
+        <w:rPr>
+          <w:rFonts w:cstheme="minorHAnsi"/>
+          <w:kern w:val="0"/>
+        </w:rPr>
+        <w:t xml:space="preserve">Write a script to push the bash script to remote hosts, run it using ssh and remove it </w:t>
+      </w:r>
+    </w:p>
+    <w:p>
+      <w:pPr>
+        <w:pStyle w:val="ListParagraph"/>
+        <w:numPr>
+          <w:ilvl w:val="0"/>
+          <w:numId w:val="2"/>
+        </w:numPr>
+        <w:autoSpaceDE w:val="0"/>
+        <w:autoSpaceDN w:val="0"/>
+        <w:adjustRightInd w:val="0"/>
+        <w:spacing w:after="0" w:line="240" w:lineRule="auto"/>
+        <w:rPr>
+          <w:rFonts w:ascii="Lucida Console" w:hAnsi="Lucida Console" w:cs="Lucida Console"/>
+          <w:color w:val="40FFFF"/>
+          <w:kern w:val="0"/>
+          <w:sz w:val="18"/>
+          <w:szCs w:val="18"/>
+        </w:rPr>
+      </w:pPr>
+      <w:r>
+        <w:rPr>
+          <w:rFonts w:ascii="Lucida Console" w:hAnsi="Lucida Console" w:cs="Lucida Console"/>
+          <w:color w:val="40FFFF"/>
+          <w:kern w:val="0"/>
+          <w:sz w:val="18"/>
+          <w:szCs w:val="18"/>
+        </w:rPr>
+        <w:t>#!/bin/bash</w:t>
+      </w:r>
+    </w:p>
+    <w:p>
+      <w:pPr>
+        <w:pStyle w:val="ListParagraph"/>
+        <w:numPr>
+          <w:ilvl w:val="0"/>
+          <w:numId w:val="2"/>
+        </w:numPr>
+        <w:autoSpaceDE w:val="0"/>
+        <w:autoSpaceDN w:val="0"/>
+        <w:adjustRightInd w:val="0"/>
+        <w:spacing w:after="0" w:line="240" w:lineRule="auto"/>
+        <w:rPr>
+          <w:rFonts w:ascii="Lucida Console" w:hAnsi="Lucida Console" w:cs="Lucida Console"/>
+          <w:color w:val="40FFFF"/>
+          <w:kern w:val="0"/>
+          <w:sz w:val="18"/>
+          <w:szCs w:val="18"/>
+        </w:rPr>
+      </w:pPr>
+    </w:p>
+    <w:p>
+      <w:pPr>
+        <w:pStyle w:val="ListParagraph"/>
+        <w:numPr>
+          <w:ilvl w:val="0"/>
+          <w:numId w:val="2"/>
+        </w:numPr>
+        <w:autoSpaceDE w:val="0"/>
+        <w:autoSpaceDN w:val="0"/>
+        <w:adjustRightInd w:val="0"/>
+        <w:spacing w:after="0" w:line="240" w:lineRule="auto"/>
+        <w:rPr>
+          <w:rFonts w:ascii="Lucida Console" w:hAnsi="Lucida Console" w:cs="Lucida Console"/>
+          <w:color w:val="FFFF40"/>
+          <w:kern w:val="0"/>
+          <w:sz w:val="18"/>
+          <w:szCs w:val="18"/>
+        </w:rPr>
+      </w:pPr>
+      <w:r>
+        <w:rPr>
+          <w:rFonts w:ascii="Lucida Console" w:hAnsi="Lucida Console" w:cs="Lucida Console"/>
+          <w:color w:val="40FFFF"/>
+          <w:kern w:val="0"/>
+          <w:sz w:val="18"/>
+          <w:szCs w:val="18"/>
+        </w:rPr>
+        <w:t>USR</w:t>
+      </w:r>
+      <w:r>
+        <w:rPr>
+          <w:rFonts w:ascii="Lucida Console" w:hAnsi="Lucida Console" w:cs="Lucida Console"/>
+          <w:kern w:val="0"/>
+          <w:sz w:val="18"/>
+          <w:szCs w:val="18"/>
+        </w:rPr>
+        <w:t>=</w:t>
+      </w:r>
+      <w:r>
+        <w:rPr>
+          <w:rFonts w:ascii="Lucida Console" w:hAnsi="Lucida Console" w:cs="Lucida Console"/>
+          <w:color w:val="FFFF40"/>
+          <w:kern w:val="0"/>
+          <w:sz w:val="18"/>
+          <w:szCs w:val="18"/>
+        </w:rPr>
+        <w:t>'</w:t>
+      </w:r>
+      <w:r>
+        <w:rPr>
+          <w:rFonts w:ascii="Lucida Console" w:hAnsi="Lucida Console" w:cs="Lucida Console"/>
+          <w:color w:val="FF40FF"/>
+          <w:kern w:val="0"/>
+          <w:sz w:val="18"/>
+          <w:szCs w:val="18"/>
+        </w:rPr>
+        <w:t>devops</w:t>
+      </w:r>
+      <w:r>
+        <w:rPr>
+          <w:rFonts w:ascii="Lucida Console" w:hAnsi="Lucida Console" w:cs="Lucida Console"/>
+          <w:color w:val="FFFF40"/>
+          <w:kern w:val="0"/>
+          <w:sz w:val="18"/>
+          <w:szCs w:val="18"/>
+        </w:rPr>
+        <w:t>'</w:t>
+      </w:r>
+    </w:p>
+    <w:p>
+      <w:pPr>
+        <w:pStyle w:val="ListParagraph"/>
+        <w:numPr>
+          <w:ilvl w:val="0"/>
+          <w:numId w:val="2"/>
+        </w:numPr>
+        <w:autoSpaceDE w:val="0"/>
+        <w:autoSpaceDN w:val="0"/>
+        <w:adjustRightInd w:val="0"/>
+        <w:spacing w:after="0" w:line="240" w:lineRule="auto"/>
+        <w:rPr>
+          <w:rFonts w:ascii="Lucida Console" w:hAnsi="Lucida Console" w:cs="Lucida Console"/>
+          <w:color w:val="FFFF40"/>
+          <w:kern w:val="0"/>
+          <w:sz w:val="18"/>
+          <w:szCs w:val="18"/>
+        </w:rPr>
+      </w:pPr>
+    </w:p>
+    <w:p>
+      <w:pPr>
+        <w:pStyle w:val="ListParagraph"/>
+        <w:numPr>
+          <w:ilvl w:val="0"/>
+          <w:numId w:val="2"/>
+        </w:numPr>
+        <w:autoSpaceDE w:val="0"/>
+        <w:autoSpaceDN w:val="0"/>
+        <w:adjustRightInd w:val="0"/>
+        <w:spacing w:after="0" w:line="240" w:lineRule="auto"/>
+        <w:rPr>
+          <w:rFonts w:ascii="Lucida Console" w:hAnsi="Lucida Console" w:cs="Lucida Console"/>
+          <w:color w:val="FF4040"/>
+          <w:kern w:val="0"/>
+          <w:sz w:val="18"/>
+          <w:szCs w:val="18"/>
+        </w:rPr>
+      </w:pPr>
+      <w:r>
+        <w:rPr>
+          <w:rFonts w:ascii="Lucida Console" w:hAnsi="Lucida Console" w:cs="Lucida Console"/>
+          <w:color w:val="FFFF40"/>
+          <w:kern w:val="0"/>
+          <w:sz w:val="18"/>
+          <w:szCs w:val="18"/>
+        </w:rPr>
+        <w:t>for</w:t>
+      </w:r>
+      <w:r>
+        <w:rPr>
+          <w:rFonts w:ascii="Lucida Console" w:hAnsi="Lucida Console" w:cs="Lucida Console"/>
+          <w:kern w:val="0"/>
+          <w:sz w:val="18"/>
+          <w:szCs w:val="18"/>
+        </w:rPr>
+        <w:t xml:space="preserve"> host </w:t>
+      </w:r>
+      <w:r>
+        <w:rPr>
+          <w:rFonts w:ascii="Lucida Console" w:hAnsi="Lucida Console" w:cs="Lucida Console"/>
+          <w:color w:val="FFFF40"/>
+          <w:kern w:val="0"/>
+          <w:sz w:val="18"/>
+          <w:szCs w:val="18"/>
+        </w:rPr>
+        <w:t>in</w:t>
+      </w:r>
+      <w:r>
+        <w:rPr>
+          <w:rFonts w:ascii="Lucida Console" w:hAnsi="Lucida Console" w:cs="Lucida Console"/>
+          <w:kern w:val="0"/>
+          <w:sz w:val="18"/>
+          <w:szCs w:val="18"/>
+        </w:rPr>
+        <w:t xml:space="preserve"> </w:t>
+      </w:r>
+      <w:r>
+        <w:rPr>
+          <w:rFonts w:ascii="Lucida Console" w:hAnsi="Lucida Console" w:cs="Lucida Console"/>
+          <w:color w:val="FF4040"/>
+          <w:kern w:val="0"/>
+          <w:sz w:val="18"/>
+          <w:szCs w:val="18"/>
+        </w:rPr>
+        <w:t>`cat remhosts`</w:t>
+      </w:r>
+    </w:p>
+    <w:p>
+      <w:pPr>
+        <w:pStyle w:val="ListParagraph"/>
+        <w:numPr>
+          <w:ilvl w:val="0"/>
+          <w:numId w:val="2"/>
+        </w:numPr>
+        <w:autoSpaceDE w:val="0"/>
+        <w:autoSpaceDN w:val="0"/>
+        <w:adjustRightInd w:val="0"/>
+        <w:spacing w:after="0" w:line="240" w:lineRule="auto"/>
+        <w:rPr>
+          <w:rFonts w:ascii="Lucida Console" w:hAnsi="Lucida Console" w:cs="Lucida Console"/>
+          <w:color w:val="FFFF40"/>
+          <w:kern w:val="0"/>
+          <w:sz w:val="18"/>
+          <w:szCs w:val="18"/>
+        </w:rPr>
+      </w:pPr>
+      <w:r>
+        <w:rPr>
+          <w:rFonts w:ascii="Lucida Console" w:hAnsi="Lucida Console" w:cs="Lucida Console"/>
+          <w:color w:val="FFFF40"/>
+          <w:kern w:val="0"/>
+          <w:sz w:val="18"/>
+          <w:szCs w:val="18"/>
+        </w:rPr>
+        <w:t>do</w:t>
+      </w:r>
+    </w:p>
+    <w:p>
+      <w:pPr>
+        <w:pStyle w:val="ListParagraph"/>
+        <w:numPr>
+          <w:ilvl w:val="0"/>
+          <w:numId w:val="2"/>
+        </w:numPr>
+        <w:autoSpaceDE w:val="0"/>
+        <w:autoSpaceDN w:val="0"/>
+        <w:adjustRightInd w:val="0"/>
+        <w:spacing w:after="0" w:line="240" w:lineRule="auto"/>
+        <w:rPr>
+          <w:rFonts w:ascii="Lucida Console" w:hAnsi="Lucida Console" w:cs="Lucida Console"/>
+          <w:color w:val="FFFF40"/>
+          <w:kern w:val="0"/>
+          <w:sz w:val="18"/>
+          <w:szCs w:val="18"/>
+        </w:rPr>
+      </w:pPr>
+      <w:r>
+        <w:rPr>
+          <w:rFonts w:ascii="Lucida Console" w:hAnsi="Lucida Console" w:cs="Lucida Console"/>
+          <w:kern w:val="0"/>
+          <w:sz w:val="18"/>
+          <w:szCs w:val="18"/>
+        </w:rPr>
+        <w:t xml:space="preserve">        </w:t>
+      </w:r>
+      <w:r>
+        <w:rPr>
+          <w:rFonts w:ascii="Lucida Console" w:hAnsi="Lucida Console" w:cs="Lucida Console"/>
+          <w:color w:val="FFFF40"/>
+          <w:kern w:val="0"/>
+          <w:sz w:val="18"/>
+          <w:szCs w:val="18"/>
+        </w:rPr>
+        <w:t>echo</w:t>
+      </w:r>
+      <w:r>
+        <w:rPr>
+          <w:rFonts w:ascii="Lucida Console" w:hAnsi="Lucida Console" w:cs="Lucida Console"/>
+          <w:color w:val="FF40FF"/>
+          <w:kern w:val="0"/>
+          <w:sz w:val="18"/>
+          <w:szCs w:val="18"/>
+        </w:rPr>
+        <w:t xml:space="preserve"> </w:t>
+      </w:r>
+      <w:r>
+        <w:rPr>
+          <w:rFonts w:ascii="Lucida Console" w:hAnsi="Lucida Console" w:cs="Lucida Console"/>
+          <w:color w:val="FFFF40"/>
+          <w:kern w:val="0"/>
+          <w:sz w:val="18"/>
+          <w:szCs w:val="18"/>
+        </w:rPr>
+        <w:t>"</w:t>
+      </w:r>
+      <w:r>
+        <w:rPr>
+          <w:rFonts w:ascii="Lucida Console" w:hAnsi="Lucida Console" w:cs="Lucida Console"/>
+          <w:color w:val="FF40FF"/>
+          <w:kern w:val="0"/>
+          <w:sz w:val="18"/>
+          <w:szCs w:val="18"/>
+        </w:rPr>
+        <w:t>#######################</w:t>
+      </w:r>
+      <w:r>
+        <w:rPr>
+          <w:rFonts w:ascii="Lucida Console" w:hAnsi="Lucida Console" w:cs="Lucida Console"/>
+          <w:color w:val="FFFF40"/>
+          <w:kern w:val="0"/>
+          <w:sz w:val="18"/>
+          <w:szCs w:val="18"/>
+        </w:rPr>
+        <w:t>"</w:t>
+      </w:r>
+    </w:p>
+    <w:p>
+      <w:pPr>
+        <w:pStyle w:val="ListParagraph"/>
+        <w:numPr>
+          <w:ilvl w:val="0"/>
+          <w:numId w:val="2"/>
+        </w:numPr>
+        <w:autoSpaceDE w:val="0"/>
+        <w:autoSpaceDN w:val="0"/>
+        <w:adjustRightInd w:val="0"/>
+        <w:spacing w:after="0" w:line="240" w:lineRule="auto"/>
+        <w:rPr>
+          <w:rFonts w:ascii="Lucida Console" w:hAnsi="Lucida Console" w:cs="Lucida Console"/>
+          <w:color w:val="FFFF40"/>
+          <w:kern w:val="0"/>
+          <w:sz w:val="18"/>
+          <w:szCs w:val="18"/>
+        </w:rPr>
+      </w:pPr>
+      <w:r>
+        <w:rPr>
+          <w:rFonts w:ascii="Lucida Console" w:hAnsi="Lucida Console" w:cs="Lucida Console"/>
+          <w:kern w:val="0"/>
+          <w:sz w:val="18"/>
+          <w:szCs w:val="18"/>
+        </w:rPr>
+        <w:t xml:space="preserve">        </w:t>
+      </w:r>
+      <w:r>
+        <w:rPr>
+          <w:rFonts w:ascii="Lucida Console" w:hAnsi="Lucida Console" w:cs="Lucida Console"/>
+          <w:color w:val="FFFF40"/>
+          <w:kern w:val="0"/>
+          <w:sz w:val="18"/>
+          <w:szCs w:val="18"/>
+        </w:rPr>
+        <w:t>echo</w:t>
+      </w:r>
+      <w:r>
+        <w:rPr>
+          <w:rFonts w:ascii="Lucida Console" w:hAnsi="Lucida Console" w:cs="Lucida Console"/>
+          <w:color w:val="FF40FF"/>
+          <w:kern w:val="0"/>
+          <w:sz w:val="18"/>
+          <w:szCs w:val="18"/>
+        </w:rPr>
+        <w:t xml:space="preserve"> </w:t>
+      </w:r>
+      <w:r>
+        <w:rPr>
+          <w:rFonts w:ascii="Lucida Console" w:hAnsi="Lucida Console" w:cs="Lucida Console"/>
+          <w:color w:val="FFFF40"/>
+          <w:kern w:val="0"/>
+          <w:sz w:val="18"/>
+          <w:szCs w:val="18"/>
+        </w:rPr>
+        <w:t>"</w:t>
+      </w:r>
+      <w:r>
+        <w:rPr>
+          <w:rFonts w:ascii="Lucida Console" w:hAnsi="Lucida Console" w:cs="Lucida Console"/>
+          <w:color w:val="FF40FF"/>
+          <w:kern w:val="0"/>
+          <w:sz w:val="18"/>
+          <w:szCs w:val="18"/>
+        </w:rPr>
+        <w:t xml:space="preserve">Connecting to </w:t>
+      </w:r>
+      <w:r>
+        <w:rPr>
+          <w:rFonts w:ascii="Lucida Console" w:hAnsi="Lucida Console" w:cs="Lucida Console"/>
+          <w:color w:val="6060FF"/>
+          <w:kern w:val="0"/>
+          <w:sz w:val="18"/>
+          <w:szCs w:val="18"/>
+        </w:rPr>
+        <w:t>$host</w:t>
+      </w:r>
+      <w:r>
+        <w:rPr>
+          <w:rFonts w:ascii="Lucida Console" w:hAnsi="Lucida Console" w:cs="Lucida Console"/>
+          <w:color w:val="FFFF40"/>
+          <w:kern w:val="0"/>
+          <w:sz w:val="18"/>
+          <w:szCs w:val="18"/>
+        </w:rPr>
+        <w:t>"</w:t>
+      </w:r>
+    </w:p>
+    <w:p>
+      <w:pPr>
+        <w:pStyle w:val="ListParagraph"/>
+        <w:numPr>
+          <w:ilvl w:val="0"/>
+          <w:numId w:val="2"/>
+        </w:numPr>
+        <w:autoSpaceDE w:val="0"/>
+        <w:autoSpaceDN w:val="0"/>
+        <w:adjustRightInd w:val="0"/>
+        <w:spacing w:after="0" w:line="240" w:lineRule="auto"/>
+        <w:rPr>
+          <w:rFonts w:ascii="Lucida Console" w:hAnsi="Lucida Console" w:cs="Lucida Console"/>
+          <w:kern w:val="0"/>
+          <w:sz w:val="18"/>
+          <w:szCs w:val="18"/>
+        </w:rPr>
+      </w:pPr>
+      <w:r>
+        <w:rPr>
+          <w:rFonts w:ascii="Lucida Console" w:hAnsi="Lucida Console" w:cs="Lucida Console"/>
+          <w:kern w:val="0"/>
+          <w:sz w:val="18"/>
+          <w:szCs w:val="18"/>
+        </w:rPr>
+        <w:t xml:space="preserve">        scp muitios_websetup.sh </w:t>
+      </w:r>
+      <w:r>
+        <w:rPr>
+          <w:rFonts w:ascii="Lucida Console" w:hAnsi="Lucida Console" w:cs="Lucida Console"/>
+          <w:color w:val="6060FF"/>
+          <w:kern w:val="0"/>
+          <w:sz w:val="18"/>
+          <w:szCs w:val="18"/>
+        </w:rPr>
+        <w:t>$USR</w:t>
+      </w:r>
+      <w:r>
+        <w:rPr>
+          <w:rFonts w:ascii="Lucida Console" w:hAnsi="Lucida Console" w:cs="Lucida Console"/>
+          <w:kern w:val="0"/>
+          <w:sz w:val="18"/>
+          <w:szCs w:val="18"/>
+        </w:rPr>
+        <w:t>@</w:t>
+      </w:r>
+      <w:r>
+        <w:rPr>
+          <w:rFonts w:ascii="Lucida Console" w:hAnsi="Lucida Console" w:cs="Lucida Console"/>
+          <w:color w:val="6060FF"/>
+          <w:kern w:val="0"/>
+          <w:sz w:val="18"/>
+          <w:szCs w:val="18"/>
+        </w:rPr>
+        <w:t>$host</w:t>
+      </w:r>
+      <w:r>
+        <w:rPr>
+          <w:rFonts w:ascii="Lucida Console" w:hAnsi="Lucida Console" w:cs="Lucida Console"/>
+          <w:kern w:val="0"/>
+          <w:sz w:val="18"/>
+          <w:szCs w:val="18"/>
+        </w:rPr>
+        <w:t>:/tmp/</w:t>
+      </w:r>
+    </w:p>
+    <w:p>
+      <w:pPr>
+        <w:pStyle w:val="ListParagraph"/>
+        <w:numPr>
+          <w:ilvl w:val="0"/>
+          <w:numId w:val="2"/>
+        </w:numPr>
+        <w:autoSpaceDE w:val="0"/>
+        <w:autoSpaceDN w:val="0"/>
+        <w:adjustRightInd w:val="0"/>
+        <w:spacing w:after="0" w:line="240" w:lineRule="auto"/>
+        <w:rPr>
+          <w:rFonts w:ascii="Lucida Console" w:hAnsi="Lucida Console" w:cs="Lucida Console"/>
+          <w:kern w:val="0"/>
+          <w:sz w:val="18"/>
+          <w:szCs w:val="18"/>
+        </w:rPr>
+      </w:pPr>
+      <w:r>
+        <w:rPr>
+          <w:rFonts w:ascii="Lucida Console" w:hAnsi="Lucida Console" w:cs="Lucida Console"/>
+          <w:kern w:val="0"/>
+          <w:sz w:val="18"/>
+          <w:szCs w:val="18"/>
+        </w:rPr>
+        <w:t xml:space="preserve">        ssh </w:t>
+      </w:r>
+      <w:r>
+        <w:rPr>
+          <w:rFonts w:ascii="Lucida Console" w:hAnsi="Lucida Console" w:cs="Lucida Console"/>
+          <w:color w:val="6060FF"/>
+          <w:kern w:val="0"/>
+          <w:sz w:val="18"/>
+          <w:szCs w:val="18"/>
+        </w:rPr>
+        <w:t>$USR</w:t>
+      </w:r>
+      <w:r>
+        <w:rPr>
+          <w:rFonts w:ascii="Lucida Console" w:hAnsi="Lucida Console" w:cs="Lucida Console"/>
+          <w:kern w:val="0"/>
+          <w:sz w:val="18"/>
+          <w:szCs w:val="18"/>
+        </w:rPr>
+        <w:t>@</w:t>
+      </w:r>
+      <w:r>
+        <w:rPr>
+          <w:rFonts w:ascii="Lucida Console" w:hAnsi="Lucida Console" w:cs="Lucida Console"/>
+          <w:color w:val="6060FF"/>
+          <w:kern w:val="0"/>
+          <w:sz w:val="18"/>
+          <w:szCs w:val="18"/>
+        </w:rPr>
+        <w:t>$host</w:t>
+      </w:r>
+      <w:r>
+        <w:rPr>
+          <w:rFonts w:ascii="Lucida Console" w:hAnsi="Lucida Console" w:cs="Lucida Console"/>
+          <w:kern w:val="0"/>
+          <w:sz w:val="18"/>
+          <w:szCs w:val="18"/>
+        </w:rPr>
+        <w:t xml:space="preserve"> sudo /tmp/multios_websetup.sh</w:t>
+      </w:r>
+    </w:p>
+    <w:p>
+      <w:pPr>
+        <w:pStyle w:val="ListParagraph"/>
+        <w:numPr>
+          <w:ilvl w:val="0"/>
+          <w:numId w:val="2"/>
+        </w:numPr>
+        <w:autoSpaceDE w:val="0"/>
+        <w:autoSpaceDN w:val="0"/>
+        <w:adjustRightInd w:val="0"/>
+        <w:spacing w:after="0" w:line="240" w:lineRule="auto"/>
+        <w:rPr>
+          <w:rFonts w:ascii="Lucida Console" w:hAnsi="Lucida Console" w:cs="Lucida Console"/>
+          <w:kern w:val="0"/>
+          <w:sz w:val="18"/>
+          <w:szCs w:val="18"/>
+        </w:rPr>
+      </w:pPr>
+      <w:r>
+        <w:rPr>
+          <w:rFonts w:ascii="Lucida Console" w:hAnsi="Lucida Console" w:cs="Lucida Console"/>
+          <w:kern w:val="0"/>
+          <w:sz w:val="18"/>
+          <w:szCs w:val="18"/>
+        </w:rPr>
+        <w:t xml:space="preserve">        ssh </w:t>
+      </w:r>
+      <w:r>
+        <w:rPr>
+          <w:rFonts w:ascii="Lucida Console" w:hAnsi="Lucida Console" w:cs="Lucida Console"/>
+          <w:color w:val="6060FF"/>
+          <w:kern w:val="0"/>
+          <w:sz w:val="18"/>
+          <w:szCs w:val="18"/>
+        </w:rPr>
+        <w:t>$USR</w:t>
+      </w:r>
+      <w:r>
+        <w:rPr>
+          <w:rFonts w:ascii="Lucida Console" w:hAnsi="Lucida Console" w:cs="Lucida Console"/>
+          <w:kern w:val="0"/>
+          <w:sz w:val="18"/>
+          <w:szCs w:val="18"/>
+        </w:rPr>
+        <w:t>@</w:t>
+      </w:r>
+      <w:r>
+        <w:rPr>
+          <w:rFonts w:ascii="Lucida Console" w:hAnsi="Lucida Console" w:cs="Lucida Console"/>
+          <w:color w:val="6060FF"/>
+          <w:kern w:val="0"/>
+          <w:sz w:val="18"/>
+          <w:szCs w:val="18"/>
+        </w:rPr>
+        <w:t>$host</w:t>
+      </w:r>
+      <w:r>
+        <w:rPr>
+          <w:rFonts w:ascii="Lucida Console" w:hAnsi="Lucida Console" w:cs="Lucida Console"/>
+          <w:kern w:val="0"/>
+          <w:sz w:val="18"/>
+          <w:szCs w:val="18"/>
+        </w:rPr>
+        <w:t xml:space="preserve"> sudo </w:t>
+      </w:r>
+      <w:r>
+        <w:rPr>
+          <w:rFonts w:ascii="Lucida Console" w:hAnsi="Lucida Console" w:cs="Lucida Console"/>
+          <w:color w:val="FFFF40"/>
+          <w:kern w:val="0"/>
+          <w:sz w:val="18"/>
+          <w:szCs w:val="18"/>
+        </w:rPr>
+        <w:t>rm</w:t>
+      </w:r>
+      <w:r>
+        <w:rPr>
+          <w:rFonts w:ascii="Lucida Console" w:hAnsi="Lucida Console" w:cs="Lucida Console"/>
+          <w:kern w:val="0"/>
+          <w:sz w:val="18"/>
+          <w:szCs w:val="18"/>
+        </w:rPr>
+        <w:t xml:space="preserve"> </w:t>
+      </w:r>
+      <w:r>
+        <w:rPr>
+          <w:rFonts w:ascii="Lucida Console" w:hAnsi="Lucida Console" w:cs="Lucida Console"/>
+          <w:color w:val="FF4040"/>
+          <w:kern w:val="0"/>
+          <w:sz w:val="18"/>
+          <w:szCs w:val="18"/>
+        </w:rPr>
+        <w:t>-rf</w:t>
+      </w:r>
+      <w:r>
+        <w:rPr>
+          <w:rFonts w:ascii="Lucida Console" w:hAnsi="Lucida Console" w:cs="Lucida Console"/>
+          <w:kern w:val="0"/>
+          <w:sz w:val="18"/>
+          <w:szCs w:val="18"/>
+        </w:rPr>
+        <w:t xml:space="preserve"> /tmp/multios_websetup.sh</w:t>
+      </w:r>
+    </w:p>
+    <w:p>
+      <w:pPr>
+        <w:pStyle w:val="ListParagraph"/>
+        <w:numPr>
+          <w:ilvl w:val="0"/>
+          <w:numId w:val="2"/>
+        </w:numPr>
+        <w:autoSpaceDE w:val="0"/>
+        <w:autoSpaceDN w:val="0"/>
+        <w:adjustRightInd w:val="0"/>
+        <w:spacing w:after="0" w:line="240" w:lineRule="auto"/>
+        <w:rPr>
+          <w:rFonts w:ascii="Lucida Console" w:hAnsi="Lucida Console" w:cs="Lucida Console"/>
+          <w:color w:val="FFFF40"/>
+          <w:kern w:val="0"/>
+          <w:sz w:val="18"/>
+          <w:szCs w:val="18"/>
+        </w:rPr>
+      </w:pPr>
+      <w:r>
+        <w:rPr>
+          <w:rFonts w:ascii="Lucida Console" w:hAnsi="Lucida Console" w:cs="Lucida Console"/>
+          <w:color w:val="FFFF40"/>
+          <w:kern w:val="0"/>
+          <w:sz w:val="18"/>
+          <w:szCs w:val="18"/>
+        </w:rPr>
+        <w:t>done</w:t>
+      </w:r>
+    </w:p>
+    <w:p>
+      <w:pPr>
+        <w:rPr>
+          <w:rFonts w:cstheme="minorHAnsi"/>
+          <w:kern w:val="0"/>
+        </w:rPr>
+      </w:pPr>
+      <w:r>
+        <w:rPr>
+          <w:rFonts w:cstheme="minorHAnsi"/>
+          <w:kern w:val="0"/>
+        </w:rPr>
+        <w:lastRenderedPageBreak/>
+        <w:t xml:space="preserve">       </w:t>
+      </w:r>
+      <w:r>
+        <w:rPr>
+          <w:rFonts w:cstheme="minorHAnsi"/>
+          <w:kern w:val="0"/>
+        </w:rPr>
+        <w:drawing>
+          <wp:inline distT="0" distB="0" distL="0" distR="0" wp14:anchorId="41BAAD0E" wp14:editId="318DD212">
+            <wp:extent cx="5723116" cy="2865368"/>
+            <wp:effectExtent l="0" t="0" r="0" b="0"/>
+            <wp:docPr id="396523312" name="Picture 1"/>
+            <wp:cNvGraphicFramePr>
+              <a:graphicFrameLocks xmlns:a="http://schemas.openxmlformats.org/drawingml/2006/main" noChangeAspect="1"/>
+            </wp:cNvGraphicFramePr>
+            <a:graphic xmlns:a="http://schemas.openxmlformats.org/drawingml/2006/main">
+              <a:graphicData uri="http://schemas.openxmlformats.org/drawingml/2006/picture">
+                <pic:pic xmlns:pic="http://schemas.openxmlformats.org/drawingml/2006/picture">
+                  <pic:nvPicPr>
+                    <pic:cNvPr id="396523312" name=""/>
+                    <pic:cNvPicPr/>
+                  </pic:nvPicPr>
+                  <pic:blipFill>
+                    <a:blip r:embed="rId23"/>
+                    <a:stretch>
+                      <a:fillRect/>
+                    </a:stretch>
+                  </pic:blipFill>
+                  <pic:spPr>
+                    <a:xfrm>
+                      <a:off x="0" y="0"/>
+                      <a:ext cx="5723116" cy="2865368"/>
+                    </a:xfrm>
+                    <a:prstGeom prst="rect">
+                      <a:avLst/>
+                    </a:prstGeom>
+                  </pic:spPr>
+                </pic:pic>
+              </a:graphicData>
+            </a:graphic>
+          </wp:inline>
+        </w:drawing>
+      </w:r>
+    </w:p>
+    <w:p>
+      <w:pPr>
+        <w:rPr>
+          <w:rFonts w:cstheme="minorHAnsi"/>
+          <w:kern w:val="0"/>
+        </w:rPr>
+      </w:pPr>
+      <w:r>
+        <w:rPr>
+          <w:rFonts w:cstheme="minorHAnsi"/>
+          <w:kern w:val="0"/>
+        </w:rPr>
+        <w:drawing>
+          <wp:inline distT="0" distB="0" distL="0" distR="0" wp14:anchorId="256A63F8" wp14:editId="7D89DB4F">
+            <wp:extent cx="5730737" cy="2865368"/>
+            <wp:effectExtent l="0" t="0" r="3810" b="0"/>
+            <wp:docPr id="1929258261" name="Picture 1"/>
+            <wp:cNvGraphicFramePr>
+              <a:graphicFrameLocks xmlns:a="http://schemas.openxmlformats.org/drawingml/2006/main" noChangeAspect="1"/>
+            </wp:cNvGraphicFramePr>
+            <a:graphic xmlns:a="http://schemas.openxmlformats.org/drawingml/2006/main">
+              <a:graphicData uri="http://schemas.openxmlformats.org/drawingml/2006/picture">
+                <pic:pic xmlns:pic="http://schemas.openxmlformats.org/drawingml/2006/picture">
+                  <pic:nvPicPr>
+                    <pic:cNvPr id="1929258261" name=""/>
+                    <pic:cNvPicPr/>
+                  </pic:nvPicPr>
+                  <pic:blipFill>
+                    <a:blip r:embed="rId24"/>
+                    <a:stretch>
+                      <a:fillRect/>
+                    </a:stretch>
+                  </pic:blipFill>
+                  <pic:spPr>
+                    <a:xfrm>
+                      <a:off x="0" y="0"/>
+                      <a:ext cx="5730737" cy="2865368"/>
+                    </a:xfrm>
+                    <a:prstGeom prst="rect">
+                      <a:avLst/>
+                    </a:prstGeom>
+                  </pic:spPr>
+                </pic:pic>
+              </a:graphicData>
+            </a:graphic>
+          </wp:inline>
+        </w:drawing>
+      </w:r>
+    </w:p>
+    <w:p>
+      <w:pPr>
+        <w:rPr>
+          <w:rFonts w:cstheme="minorHAnsi"/>
+          <w:kern w:val="0"/>
+        </w:rPr>
+      </w:pPr>
+      <w:r>
+        <w:rPr>
+          <w:rFonts w:cstheme="minorHAnsi"/>
+          <w:kern w:val="0"/>
+        </w:rPr>
+        <w:lastRenderedPageBreak/>
+        <w:drawing>
+          <wp:inline distT="0" distB="0" distL="0" distR="0" wp14:anchorId="46F9831B" wp14:editId="6D277FA4">
+            <wp:extent cx="5654530" cy="3101609"/>
+            <wp:effectExtent l="0" t="0" r="3810" b="3810"/>
+            <wp:docPr id="2110818856" name="Picture 1"/>
+            <wp:cNvGraphicFramePr>
+              <a:graphicFrameLocks xmlns:a="http://schemas.openxmlformats.org/drawingml/2006/main" noChangeAspect="1"/>
+            </wp:cNvGraphicFramePr>
+            <a:graphic xmlns:a="http://schemas.openxmlformats.org/drawingml/2006/main">
+              <a:graphicData uri="http://schemas.openxmlformats.org/drawingml/2006/picture">
+                <pic:pic xmlns:pic="http://schemas.openxmlformats.org/drawingml/2006/picture">
+                  <pic:nvPicPr>
+                    <pic:cNvPr id="2110818856" name=""/>
+                    <pic:cNvPicPr/>
+                  </pic:nvPicPr>
+                  <pic:blipFill>
+                    <a:blip r:embed="rId25"/>
+                    <a:stretch>
+                      <a:fillRect/>
+                    </a:stretch>
+                  </pic:blipFill>
+                  <pic:spPr>
+                    <a:xfrm>
+                      <a:off x="0" y="0"/>
+                      <a:ext cx="5654530" cy="3101609"/>
+                    </a:xfrm>
+                    <a:prstGeom prst="rect">
+                      <a:avLst/>
+                    </a:prstGeom>
+                  </pic:spPr>
+                </pic:pic>
+              </a:graphicData>
+            </a:graphic>
+          </wp:inline>
+        </w:drawing>
+      </w:r>
+    </w:p>
+    <w:p>
+      <w:pPr>
+        <w:rPr>
+          <w:rFonts w:cstheme="minorHAnsi"/>
+          <w:kern w:val="0"/>
+        </w:rPr>
+      </w:pPr>
+      <w:r>
+        <w:rPr>
+          <w:rFonts w:cstheme="minorHAnsi"/>
+          <w:kern w:val="0"/>
+        </w:rPr>
+        <w:t>Output:</w:t>
+      </w:r>
+    </w:p>
+    <w:p>
+      <w:pPr>
+        <w:rPr>
+          <w:rFonts w:cstheme="minorHAnsi"/>
+          <w:kern w:val="0"/>
+        </w:rPr>
+      </w:pPr>
+      <w:r>
+        <w:rPr>
+          <w:rFonts w:cstheme="minorHAnsi"/>
+          <w:kern w:val="0"/>
+        </w:rPr>
+        <w:t>Web01</w:t>
+      </w:r>
+    </w:p>
+    <w:p>
+      <w:pPr>
+        <w:rPr>
+          <w:rFonts w:cstheme="minorHAnsi"/>
+          <w:kern w:val="0"/>
+        </w:rPr>
+      </w:pPr>
+      <w:r>
+        <w:rPr>
+          <w:rFonts w:cstheme="minorHAnsi"/>
+          <w:kern w:val="0"/>
+        </w:rPr>
+        <w:drawing>
+          <wp:inline distT="0" distB="0" distL="0" distR="0" wp14:anchorId="6EC930C2" wp14:editId="2C3A9486">
+            <wp:extent cx="5731510" cy="2697480"/>
+            <wp:effectExtent l="0" t="0" r="2540" b="7620"/>
+            <wp:docPr id="70972442" name="Picture 1"/>
+            <wp:cNvGraphicFramePr>
+              <a:graphicFrameLocks xmlns:a="http://schemas.openxmlformats.org/drawingml/2006/main" noChangeAspect="1"/>
+            </wp:cNvGraphicFramePr>
+            <a:graphic xmlns:a="http://schemas.openxmlformats.org/drawingml/2006/main">
+              <a:graphicData uri="http://schemas.openxmlformats.org/drawingml/2006/picture">
+                <pic:pic xmlns:pic="http://schemas.openxmlformats.org/drawingml/2006/picture">
+                  <pic:nvPicPr>
+                    <pic:cNvPr id="70972442" name=""/>
+                    <pic:cNvPicPr/>
+                  </pic:nvPicPr>
+                  <pic:blipFill>
+                    <a:blip r:embed="rId26"/>
+                    <a:stretch>
+                      <a:fillRect/>
+                    </a:stretch>
+                  </pic:blipFill>
+                  <pic:spPr>
+                    <a:xfrm>
+                      <a:off x="0" y="0"/>
+                      <a:ext cx="5731510" cy="2697480"/>
+                    </a:xfrm>
+                    <a:prstGeom prst="rect">
+                      <a:avLst/>
+                    </a:prstGeom>
+                  </pic:spPr>
+                </pic:pic>
+              </a:graphicData>
+            </a:graphic>
+          </wp:inline>
+        </w:drawing>
+      </w:r>
+    </w:p>
+    <w:p>
+      <w:pPr>
+        <w:rPr>
+          <w:rFonts w:cstheme="minorHAnsi"/>
+          <w:kern w:val="0"/>
+        </w:rPr>
+      </w:pPr>
+      <w:r>
+        <w:rPr>
+          <w:rFonts w:cstheme="minorHAnsi"/>
+          <w:kern w:val="0"/>
+        </w:rPr>
+        <w:t>Web02</w:t>
+      </w:r>
+    </w:p>
+    <w:p>
+      <w:pPr>
+        <w:rPr>
+          <w:rFonts w:cstheme="minorHAnsi"/>
+          <w:kern w:val="0"/>
+        </w:rPr>
+      </w:pPr>
+      <w:r>
+        <w:rPr>
+          <w:rFonts w:cstheme="minorHAnsi"/>
+          <w:kern w:val="0"/>
+        </w:rPr>
+        <w:lastRenderedPageBreak/>
+        <w:drawing>
+          <wp:inline distT="0" distB="0" distL="0" distR="0" wp14:anchorId="7951B4E4" wp14:editId="66C9F636">
+            <wp:extent cx="5731510" cy="2864485"/>
+            <wp:effectExtent l="0" t="0" r="2540" b="0"/>
+            <wp:docPr id="84180161" name="Picture 2"/>
+            <wp:cNvGraphicFramePr>
+              <a:graphicFrameLocks xmlns:a="http://schemas.openxmlformats.org/drawingml/2006/main" noChangeAspect="1"/>
+            </wp:cNvGraphicFramePr>
+            <a:graphic xmlns:a="http://schemas.openxmlformats.org/drawingml/2006/main">
+              <a:graphicData uri="http://schemas.openxmlformats.org/drawingml/2006/picture">
+                <pic:pic xmlns:pic="http://schemas.openxmlformats.org/drawingml/2006/picture">
+                  <pic:nvPicPr>
+                    <pic:cNvPr id="0" name="Picture 6"/>
+                    <pic:cNvPicPr>
+                      <a:picLocks noChangeAspect="1" noChangeArrowheads="1"/>
+                    </pic:cNvPicPr>
+                  </pic:nvPicPr>
+                  <pic:blipFill>
+                    <a:blip r:embed="rId27" cstate="print">
+                      <a:extLst>
+                        <a:ext uri="{28A0092B-C50C-407E-A947-70E740481C1C}">
+                          <a14:useLocalDpi xmlns:a14="http://schemas.microsoft.com/office/drawing/2010/main" val="0"/>
+                        </a:ext>
+                      </a:extLst>
+                    </a:blip>
+                    <a:srcRect/>
+                    <a:stretch>
+                      <a:fillRect/>
+                    </a:stretch>
+                  </pic:blipFill>
+                  <pic:spPr bwMode="auto">
+                    <a:xfrm>
+                      <a:off x="0" y="0"/>
+                      <a:ext cx="5731510" cy="2864485"/>
+                    </a:xfrm>
+                    <a:prstGeom prst="rect">
+                      <a:avLst/>
+                    </a:prstGeom>
+                    <a:noFill/>
+                    <a:ln>
+                      <a:noFill/>
+                    </a:ln>
+                  </pic:spPr>
+                </pic:pic>
+              </a:graphicData>
+            </a:graphic>
+          </wp:inline>
+        </w:drawing>
+      </w:r>
+    </w:p>
+    <w:p>
+      <w:pPr>
+        <w:rPr>
+          <w:rFonts w:cstheme="minorHAnsi"/>
+          <w:kern w:val="0"/>
+        </w:rPr>
+      </w:pPr>
+      <w:r>
+        <w:rPr>
+          <w:rFonts w:cstheme="minorHAnsi"/>
+          <w:kern w:val="0"/>
+        </w:rPr>
+        <w:t>Web03 - UbuntuOS</w:t>
+      </w:r>
+    </w:p>
+    <w:p>
+      <w:pPr>
+        <w:rPr>
+          <w:rFonts w:cstheme="minorHAnsi"/>
+          <w:kern w:val="0"/>
+        </w:rPr>
+      </w:pPr>
+      <w:r>
+        <w:rPr>
+          <w:rFonts w:cstheme="minorHAnsi"/>
+          <w:kern w:val="0"/>
+        </w:rPr>
+        <w:drawing>
+          <wp:inline distT="0" distB="0" distL="0" distR="0" wp14:anchorId="4EE68DCE" wp14:editId="3AFF6C89">
+            <wp:extent cx="5731510" cy="2632710"/>
+            <wp:effectExtent l="0" t="0" r="2540" b="0"/>
+            <wp:docPr id="444101743" name="Picture 1"/>
+            <wp:cNvGraphicFramePr>
+              <a:graphicFrameLocks xmlns:a="http://schemas.openxmlformats.org/drawingml/2006/main" noChangeAspect="1"/>
+            </wp:cNvGraphicFramePr>
+            <a:graphic xmlns:a="http://schemas.openxmlformats.org/drawingml/2006/main">
+              <a:graphicData uri="http://schemas.openxmlformats.org/drawingml/2006/picture">
+                <pic:pic xmlns:pic="http://schemas.openxmlformats.org/drawingml/2006/picture">
+                  <pic:nvPicPr>
+                    <pic:cNvPr id="444101743" name=""/>
+                    <pic:cNvPicPr/>
+                  </pic:nvPicPr>
+                  <pic:blipFill>
+                    <a:blip r:embed="rId28"/>
+                    <a:stretch>
+                      <a:fillRect/>
+                    </a:stretch>
+                  </pic:blipFill>
+                  <pic:spPr>
+                    <a:xfrm>
+                      <a:off x="0" y="0"/>
+                      <a:ext cx="5731510" cy="2632710"/>
+                    </a:xfrm>
+                    <a:prstGeom prst="rect">
+                      <a:avLst/>
+                    </a:prstGeom>
+                  </pic:spPr>
+                </pic:pic>
+              </a:graphicData>
+            </a:graphic>
+          </wp:inline>
+        </w:drawing>
+      </w:r>
+    </w:p>
+    <w:p>
+      <w:pPr>
+        <w:rPr>
+          <w:rFonts w:cstheme="minorHAnsi"/>
+          <w:kern w:val="0"/>
+        </w:rPr>
+      </w:pPr>
+    </w:p>
+    <w:p>
+      <w:pPr>
+        <w:rPr>
+          <w:rFonts w:cstheme="minorHAnsi"/>
+          <w:kern w:val="0"/>
+        </w:rPr>
+      </w:pPr>
+      <w:r>
+        <w:rPr>
+          <w:rFonts w:cstheme="minorHAnsi"/>
+          <w:kern w:val="0"/>
+        </w:rPr>
+        <w:t xml:space="preserve">              </w:t>
+      </w:r>
+    </w:p>
+    <w:p>
+      <w:pPr>
+        <w:rPr>
+          <w:rFonts w:cstheme="minorHAnsi"/>
+          <w:sz w:val="28"/>
+          <w:szCs w:val="28"/>
+        </w:rPr>
+      </w:pPr>
+    </w:p>
+    <w:p>
+      <w:pPr>
+        <w:pStyle w:val="ListParagraph"/>
+      </w:pPr>
+    </w:p>
+    <w:p/>
+    <w:p/>
     <w:p/>
     <w:p/>
     <w:sectPr>
@@ -221,9 +3680,9 @@
 <file path=word/numbering.xml><?xml version="1.0" encoding="utf-8"?>
 <w:numbering xmlns:wpc="http://schemas.microsoft.com/office/word/2010/wordprocessingCanvas" xmlns:cx="http://schemas.microsoft.com/office/drawing/2014/chartex" xmlns:cx1="http://schemas.microsoft.com/office/drawing/2015/9/8/chartex" xmlns:cx2="http://schemas.microsoft.com/office/drawing/2015/10/21/chartex" xmlns:cx3="http://schemas.microsoft.com/office/drawing/2016/5/9/chartex" xmlns:cx4="http://schemas.microsoft.com/office/drawing/2016/5/10/chartex" xmlns:cx5="http://schemas.microsoft.com/office/drawing/2016/5/11/chartex" xmlns:cx6="http://schemas.microsoft.com/office/drawing/2016/5/12/chartex" xmlns:cx7="http://schemas.microsoft.com/office/drawing/2016/5/13/chartex" xmlns:cx8="http://schemas.microsoft.com/office/drawing/2016/5/14/chartex" xmlns:mc="http://schemas.openxmlformats.org/markup-compatibility/2006" xmlns:aink="http://schemas.microsoft.com/office/drawing/2016/ink" xmlns:am3d="http://schemas.microsoft.com/office/drawing/2017/model3d" xmlns:o="urn:schemas-microsoft-com:office:office" xmlns:oel="http://schemas.microsoft.com/office/2019/extlst" xmlns:r="http://schemas.openxmlformats.org/officeDocument/2006/relationships" xmlns:m="http://schemas.openxmlformats.org/officeDocument/2006/math" xmlns:v="urn:schemas-microsoft-com:vml" xmlns:wp14="http://schemas.microsoft.com/office/word/2010/wordprocessingDrawing" xmlns:wp="http://schemas.openxmlformats.org/drawingml/2006/wordprocessingDrawing" xmlns:w10="urn:schemas-microsoft-com:office:word" xmlns:w="http://schemas.openxmlformats.org/wordprocessingml/2006/main" xmlns:w14="http://schemas.microsoft.com/office/word/2010/wordml" xmlns:w15="http://schemas.microsoft.com/office/word/2012/wordml" xmlns:w16cex="http://schemas.microsoft.com/office/word/2018/wordml/cex" xmlns:w16cid="http://schemas.microsoft.com/office/word/2016/wordml/cid" xmlns:w16="http://schemas.microsoft.com/office/word/2018/wordml" xmlns:w16du="http://schemas.microsoft.com/office/word/2023/wordml/word16du" xmlns:w16sdtdh="http://schemas.microsoft.com/office/word/2020/wordml/sdtdatahash" xmlns:w16sdtfl="http://schemas.microsoft.com/office/word/2024/wordml/sdtformatlock" xmlns:w16se="http://schemas.microsoft.com/office/word/2015/wordml/symex" xmlns:wpg="http://schemas.microsoft.com/office/word/2010/wordprocessingGroup" xmlns:wpi="http://schemas.microsoft.com/office/word/2010/wordprocessingInk" xmlns:wne="http://schemas.microsoft.com/office/word/2006/wordml" xmlns:wps="http://schemas.microsoft.com/office/word/2010/wordprocessingShape" mc:Ignorable="w14 w15 w16se w16cid w16 w16cex w16sdtdh w16sdtfl w16du wp14">
   <w:abstractNum w:abstractNumId="0" w15:restartNumberingAfterBreak="0">
-    <w:nsid w:val="2887053E"/>
+    <w:nsid w:val="04BB2BFB"/>
     <w:multiLevelType w:val="hybridMultilevel"/>
-    <w:tmpl w:val="8BFA6CA8"/>
+    <w:tmpl w:val="461E6E0C"/>
     <w:lvl w:ilvl="0" w:tplc="4009000F">
       <w:start w:val="1"/>
       <w:numFmt w:val="decimal"/>
@@ -310,6 +3769,184 @@
     </w:lvl>
   </w:abstractNum>
   <w:abstractNum w:abstractNumId="1" w15:restartNumberingAfterBreak="0">
+    <w:nsid w:val="1B007E49"/>
+    <w:multiLevelType w:val="hybridMultilevel"/>
+    <w:tmpl w:val="3E7A184E"/>
+    <w:lvl w:ilvl="0" w:tplc="4009000F">
+      <w:start w:val="1"/>
+      <w:numFmt w:val="decimal"/>
+      <w:lvlText w:val="%1."/>
+      <w:lvlJc w:val="left"/>
+      <w:pPr>
+        <w:ind w:left="720" w:hanging="360"/>
+      </w:pPr>
+      <w:rPr>
+        <w:rFonts w:hint="default"/>
+      </w:rPr>
+    </w:lvl>
+    <w:lvl w:ilvl="1" w:tplc="40090019" w:tentative="1">
+      <w:start w:val="1"/>
+      <w:numFmt w:val="lowerLetter"/>
+      <w:lvlText w:val="%2."/>
+      <w:lvlJc w:val="left"/>
+      <w:pPr>
+        <w:ind w:left="1440" w:hanging="360"/>
+      </w:pPr>
+    </w:lvl>
+    <w:lvl w:ilvl="2" w:tplc="4009001B" w:tentative="1">
+      <w:start w:val="1"/>
+      <w:numFmt w:val="lowerRoman"/>
+      <w:lvlText w:val="%3."/>
+      <w:lvlJc w:val="right"/>
+      <w:pPr>
+        <w:ind w:left="2160" w:hanging="180"/>
+      </w:pPr>
+    </w:lvl>
+    <w:lvl w:ilvl="3" w:tplc="4009000F" w:tentative="1">
+      <w:start w:val="1"/>
+      <w:numFmt w:val="decimal"/>
+      <w:lvlText w:val="%4."/>
+      <w:lvlJc w:val="left"/>
+      <w:pPr>
+        <w:ind w:left="2880" w:hanging="360"/>
+      </w:pPr>
+    </w:lvl>
+    <w:lvl w:ilvl="4" w:tplc="40090019" w:tentative="1">
+      <w:start w:val="1"/>
+      <w:numFmt w:val="lowerLetter"/>
+      <w:lvlText w:val="%5."/>
+      <w:lvlJc w:val="left"/>
+      <w:pPr>
+        <w:ind w:left="3600" w:hanging="360"/>
+      </w:pPr>
+    </w:lvl>
+    <w:lvl w:ilvl="5" w:tplc="4009001B" w:tentative="1">
+      <w:start w:val="1"/>
+      <w:numFmt w:val="lowerRoman"/>
+      <w:lvlText w:val="%6."/>
+      <w:lvlJc w:val="right"/>
+      <w:pPr>
+        <w:ind w:left="4320" w:hanging="180"/>
+      </w:pPr>
+    </w:lvl>
+    <w:lvl w:ilvl="6" w:tplc="4009000F" w:tentative="1">
+      <w:start w:val="1"/>
+      <w:numFmt w:val="decimal"/>
+      <w:lvlText w:val="%7."/>
+      <w:lvlJc w:val="left"/>
+      <w:pPr>
+        <w:ind w:left="5040" w:hanging="360"/>
+      </w:pPr>
+    </w:lvl>
+    <w:lvl w:ilvl="7" w:tplc="40090019" w:tentative="1">
+      <w:start w:val="1"/>
+      <w:numFmt w:val="lowerLetter"/>
+      <w:lvlText w:val="%8."/>
+      <w:lvlJc w:val="left"/>
+      <w:pPr>
+        <w:ind w:left="5760" w:hanging="360"/>
+      </w:pPr>
+    </w:lvl>
+    <w:lvl w:ilvl="8" w:tplc="4009001B" w:tentative="1">
+      <w:start w:val="1"/>
+      <w:numFmt w:val="lowerRoman"/>
+      <w:lvlText w:val="%9."/>
+      <w:lvlJc w:val="right"/>
+      <w:pPr>
+        <w:ind w:left="6480" w:hanging="180"/>
+      </w:pPr>
+    </w:lvl>
+  </w:abstractNum>
+  <w:abstractNum w:abstractNumId="2" w15:restartNumberingAfterBreak="0">
+    <w:nsid w:val="2887053E"/>
+    <w:multiLevelType w:val="hybridMultilevel"/>
+    <w:tmpl w:val="8BFA6CA8"/>
+    <w:lvl w:ilvl="0" w:tplc="4009000F">
+      <w:start w:val="1"/>
+      <w:numFmt w:val="decimal"/>
+      <w:lvlText w:val="%1."/>
+      <w:lvlJc w:val="left"/>
+      <w:pPr>
+        <w:ind w:left="720" w:hanging="360"/>
+      </w:pPr>
+      <w:rPr>
+        <w:rFonts w:hint="default"/>
+      </w:rPr>
+    </w:lvl>
+    <w:lvl w:ilvl="1" w:tplc="40090019" w:tentative="1">
+      <w:start w:val="1"/>
+      <w:numFmt w:val="lowerLetter"/>
+      <w:lvlText w:val="%2."/>
+      <w:lvlJc w:val="left"/>
+      <w:pPr>
+        <w:ind w:left="1440" w:hanging="360"/>
+      </w:pPr>
+    </w:lvl>
+    <w:lvl w:ilvl="2" w:tplc="4009001B" w:tentative="1">
+      <w:start w:val="1"/>
+      <w:numFmt w:val="lowerRoman"/>
+      <w:lvlText w:val="%3."/>
+      <w:lvlJc w:val="right"/>
+      <w:pPr>
+        <w:ind w:left="2160" w:hanging="180"/>
+      </w:pPr>
+    </w:lvl>
+    <w:lvl w:ilvl="3" w:tplc="4009000F" w:tentative="1">
+      <w:start w:val="1"/>
+      <w:numFmt w:val="decimal"/>
+      <w:lvlText w:val="%4."/>
+      <w:lvlJc w:val="left"/>
+      <w:pPr>
+        <w:ind w:left="2880" w:hanging="360"/>
+      </w:pPr>
+    </w:lvl>
+    <w:lvl w:ilvl="4" w:tplc="40090019" w:tentative="1">
+      <w:start w:val="1"/>
+      <w:numFmt w:val="lowerLetter"/>
+      <w:lvlText w:val="%5."/>
+      <w:lvlJc w:val="left"/>
+      <w:pPr>
+        <w:ind w:left="3600" w:hanging="360"/>
+      </w:pPr>
+    </w:lvl>
+    <w:lvl w:ilvl="5" w:tplc="4009001B" w:tentative="1">
+      <w:start w:val="1"/>
+      <w:numFmt w:val="lowerRoman"/>
+      <w:lvlText w:val="%6."/>
+      <w:lvlJc w:val="right"/>
+      <w:pPr>
+        <w:ind w:left="4320" w:hanging="180"/>
+      </w:pPr>
+    </w:lvl>
+    <w:lvl w:ilvl="6" w:tplc="4009000F" w:tentative="1">
+      <w:start w:val="1"/>
+      <w:numFmt w:val="decimal"/>
+      <w:lvlText w:val="%7."/>
+      <w:lvlJc w:val="left"/>
+      <w:pPr>
+        <w:ind w:left="5040" w:hanging="360"/>
+      </w:pPr>
+    </w:lvl>
+    <w:lvl w:ilvl="7" w:tplc="40090019" w:tentative="1">
+      <w:start w:val="1"/>
+      <w:numFmt w:val="lowerLetter"/>
+      <w:lvlText w:val="%8."/>
+      <w:lvlJc w:val="left"/>
+      <w:pPr>
+        <w:ind w:left="5760" w:hanging="360"/>
+      </w:pPr>
+    </w:lvl>
+    <w:lvl w:ilvl="8" w:tplc="4009001B" w:tentative="1">
+      <w:start w:val="1"/>
+      <w:numFmt w:val="lowerRoman"/>
+      <w:lvlText w:val="%9."/>
+      <w:lvlJc w:val="right"/>
+      <w:pPr>
+        <w:ind w:left="6480" w:hanging="180"/>
+      </w:pPr>
+    </w:lvl>
+  </w:abstractNum>
+  <w:abstractNum w:abstractNumId="3" w15:restartNumberingAfterBreak="0">
     <w:nsid w:val="3CD902E1"/>
     <w:multiLevelType w:val="multilevel"/>
     <w:tmpl w:val="3BF0F4EC"/>
@@ -458,10 +4095,108 @@
       </w:rPr>
     </w:lvl>
   </w:abstractNum>
+  <w:abstractNum w:abstractNumId="4" w15:restartNumberingAfterBreak="0">
+    <w:nsid w:val="72AB65A2"/>
+    <w:multiLevelType w:val="hybridMultilevel"/>
+    <w:tmpl w:val="8982D02E"/>
+    <w:lvl w:ilvl="0" w:tplc="4009000F">
+      <w:start w:val="1"/>
+      <w:numFmt w:val="decimal"/>
+      <w:lvlText w:val="%1."/>
+      <w:lvlJc w:val="left"/>
+      <w:pPr>
+        <w:ind w:left="720" w:hanging="360"/>
+      </w:pPr>
+      <w:rPr>
+        <w:rFonts w:hint="default"/>
+      </w:rPr>
+    </w:lvl>
+    <w:lvl w:ilvl="1" w:tplc="40090019" w:tentative="1">
+      <w:start w:val="1"/>
+      <w:numFmt w:val="lowerLetter"/>
+      <w:lvlText w:val="%2."/>
+      <w:lvlJc w:val="left"/>
+      <w:pPr>
+        <w:ind w:left="1440" w:hanging="360"/>
+      </w:pPr>
+    </w:lvl>
+    <w:lvl w:ilvl="2" w:tplc="4009001B" w:tentative="1">
+      <w:start w:val="1"/>
+      <w:numFmt w:val="lowerRoman"/>
+      <w:lvlText w:val="%3."/>
+      <w:lvlJc w:val="right"/>
+      <w:pPr>
+        <w:ind w:left="2160" w:hanging="180"/>
+      </w:pPr>
+    </w:lvl>
+    <w:lvl w:ilvl="3" w:tplc="4009000F" w:tentative="1">
+      <w:start w:val="1"/>
+      <w:numFmt w:val="decimal"/>
+      <w:lvlText w:val="%4."/>
+      <w:lvlJc w:val="left"/>
+      <w:pPr>
+        <w:ind w:left="2880" w:hanging="360"/>
+      </w:pPr>
+    </w:lvl>
+    <w:lvl w:ilvl="4" w:tplc="40090019" w:tentative="1">
+      <w:start w:val="1"/>
+      <w:numFmt w:val="lowerLetter"/>
+      <w:lvlText w:val="%5."/>
+      <w:lvlJc w:val="left"/>
+      <w:pPr>
+        <w:ind w:left="3600" w:hanging="360"/>
+      </w:pPr>
+    </w:lvl>
+    <w:lvl w:ilvl="5" w:tplc="4009001B" w:tentative="1">
+      <w:start w:val="1"/>
+      <w:numFmt w:val="lowerRoman"/>
+      <w:lvlText w:val="%6."/>
+      <w:lvlJc w:val="right"/>
+      <w:pPr>
+        <w:ind w:left="4320" w:hanging="180"/>
+      </w:pPr>
+    </w:lvl>
+    <w:lvl w:ilvl="6" w:tplc="4009000F" w:tentative="1">
+      <w:start w:val="1"/>
+      <w:numFmt w:val="decimal"/>
+      <w:lvlText w:val="%7."/>
+      <w:lvlJc w:val="left"/>
+      <w:pPr>
+        <w:ind w:left="5040" w:hanging="360"/>
+      </w:pPr>
+    </w:lvl>
+    <w:lvl w:ilvl="7" w:tplc="40090019" w:tentative="1">
+      <w:start w:val="1"/>
+      <w:numFmt w:val="lowerLetter"/>
+      <w:lvlText w:val="%8."/>
+      <w:lvlJc w:val="left"/>
+      <w:pPr>
+        <w:ind w:left="5760" w:hanging="360"/>
+      </w:pPr>
+    </w:lvl>
+    <w:lvl w:ilvl="8" w:tplc="4009001B" w:tentative="1">
+      <w:start w:val="1"/>
+      <w:numFmt w:val="lowerRoman"/>
+      <w:lvlText w:val="%9."/>
+      <w:lvlJc w:val="right"/>
+      <w:pPr>
+        <w:ind w:left="6480" w:hanging="180"/>
+      </w:pPr>
+    </w:lvl>
+  </w:abstractNum>
   <w:num w:numId="1" w16cid:durableId="1476490780">
+    <w:abstractNumId w:val="3"/>
+  </w:num>
+  <w:num w:numId="2" w16cid:durableId="2115124065">
+    <w:abstractNumId w:val="2"/>
+  </w:num>
+  <w:num w:numId="3" w16cid:durableId="1277910890">
     <w:abstractNumId w:val="1"/>
   </w:num>
-  <w:num w:numId="2" w16cid:durableId="2115124065">
+  <w:num w:numId="4" w16cid:durableId="737443096">
+    <w:abstractNumId w:val="4"/>
+  </w:num>
+  <w:num w:numId="5" w16cid:durableId="195655381">
     <w:abstractNumId w:val="0"/>
   </w:num>
 </w:numbering>

</xml_diff>